<commit_message>
Mechanic Documentation Class Diagrams Updated
</commit_message>
<xml_diff>
--- a/Final_Documentation/myMechanic.docx
+++ b/Final_Documentation/myMechanic.docx
@@ -65,47 +65,11 @@
           <w:rFonts w:ascii="Times New Roman" w:hAnsi="Times New Roman" w:cs="Times New Roman"/>
         </w:rPr>
       </w:pPr>
-      <w:proofErr w:type="spellStart"/>
-      <w:r>
-        <w:rPr>
-          <w:rFonts w:ascii="Times New Roman" w:hAnsi="Times New Roman" w:cs="Times New Roman"/>
-        </w:rPr>
-        <w:t>MyMechanic</w:t>
-      </w:r>
-      <w:proofErr w:type="spellEnd"/>
-      <w:r>
-        <w:rPr>
-          <w:rFonts w:ascii="Times New Roman" w:hAnsi="Times New Roman" w:cs="Times New Roman"/>
-        </w:rPr>
-        <w:t xml:space="preserve"> is a cross-platform mobile application designed to bridge the gap between vehicle owners and auto mechanics. Built using Flutter for a seamless UI and </w:t>
-      </w:r>
-      <w:proofErr w:type="spellStart"/>
-      <w:r>
-        <w:rPr>
-          <w:rFonts w:ascii="Times New Roman" w:hAnsi="Times New Roman" w:cs="Times New Roman"/>
-        </w:rPr>
-        <w:t>Supabase</w:t>
-      </w:r>
-      <w:proofErr w:type="spellEnd"/>
-      <w:r>
-        <w:rPr>
-          <w:rFonts w:ascii="Times New Roman" w:hAnsi="Times New Roman" w:cs="Times New Roman"/>
-        </w:rPr>
-        <w:t xml:space="preserve"> for a robust backend, the app eliminates the friction of traditional phone booking. It allows users to find reliable mechanics, view services, history </w:t>
-      </w:r>
-      <w:proofErr w:type="spellStart"/>
-      <w:r>
-        <w:rPr>
-          <w:rFonts w:ascii="Times New Roman" w:hAnsi="Times New Roman" w:cs="Times New Roman"/>
-        </w:rPr>
-        <w:t>appoimnets</w:t>
-      </w:r>
-      <w:proofErr w:type="spellEnd"/>
-      <w:r>
-        <w:rPr>
-          <w:rFonts w:ascii="Times New Roman" w:hAnsi="Times New Roman" w:cs="Times New Roman"/>
-        </w:rPr>
-        <w:t xml:space="preserve"> with the problems, and book appointments in real-time, while providing mechanics with digital tools to manage their schedule and business operations efficiently.</w:t>
+      <w:r>
+        <w:rPr>
+          <w:rFonts w:ascii="Times New Roman" w:hAnsi="Times New Roman" w:cs="Times New Roman"/>
+        </w:rPr>
+        <w:t>MyMechanic is a cross-platform mobile application designed to bridge the gap between vehicle owners and auto mechanics. Built using Flutter for a seamless UI and Supabase for a robust backend, the app eliminates the friction of traditional phone booking. It allows users to find reliable mechanics, view services, history appoimnets with the problems, and book appointments in real-time, while providing mechanics with digital tools to manage their schedule and business operations efficiently.</w:t>
       </w:r>
     </w:p>
     <w:p>
@@ -205,27 +169,7 @@
           <w:sz w:val="28"/>
           <w:szCs w:val="28"/>
         </w:rPr>
-        <w:t xml:space="preserve"> Sign </w:t>
-      </w:r>
-      <w:proofErr w:type="gramStart"/>
-      <w:r>
-        <w:rPr>
-          <w:rFonts w:ascii="Times New Roman" w:hAnsi="Times New Roman" w:cs="Times New Roman"/>
-          <w:b/>
-          <w:sz w:val="28"/>
-          <w:szCs w:val="28"/>
-        </w:rPr>
-        <w:t>In</w:t>
-      </w:r>
-      <w:proofErr w:type="gramEnd"/>
-      <w:r>
-        <w:rPr>
-          <w:rFonts w:ascii="Times New Roman" w:hAnsi="Times New Roman" w:cs="Times New Roman"/>
-          <w:b/>
-          <w:sz w:val="28"/>
-          <w:szCs w:val="28"/>
-        </w:rPr>
-        <w:t xml:space="preserve"> and Delete Account</w:t>
+        <w:t xml:space="preserve"> Sign In and Delete Account</w:t>
       </w:r>
     </w:p>
     <w:p>
@@ -496,25 +440,7 @@
           <w:b/>
           <w:bCs/>
         </w:rPr>
-        <w:t xml:space="preserve">A. Sign </w:t>
-      </w:r>
-      <w:proofErr w:type="gramStart"/>
-      <w:r>
-        <w:rPr>
-          <w:rFonts w:ascii="Times New Roman" w:hAnsi="Times New Roman" w:cs="Times New Roman"/>
-          <w:b/>
-          <w:bCs/>
-        </w:rPr>
-        <w:t>In</w:t>
-      </w:r>
-      <w:proofErr w:type="gramEnd"/>
-      <w:r>
-        <w:rPr>
-          <w:rFonts w:ascii="Times New Roman" w:hAnsi="Times New Roman" w:cs="Times New Roman"/>
-          <w:b/>
-          <w:bCs/>
-        </w:rPr>
-        <w:t xml:space="preserve"> Flow</w:t>
+        <w:t>A. Sign In Flow</w:t>
       </w:r>
     </w:p>
     <w:p>
@@ -607,21 +533,7 @@
         <w:rPr>
           <w:rFonts w:ascii="Times New Roman" w:hAnsi="Times New Roman" w:cs="Times New Roman"/>
         </w:rPr>
-        <w:t xml:space="preserve">To prevent accidental data loss, the account deletion process requires </w:t>
-      </w:r>
-      <w:proofErr w:type="gramStart"/>
-      <w:r>
-        <w:rPr>
-          <w:rFonts w:ascii="Times New Roman" w:hAnsi="Times New Roman" w:cs="Times New Roman"/>
-        </w:rPr>
-        <w:t>a high</w:t>
-      </w:r>
-      <w:proofErr w:type="gramEnd"/>
-      <w:r>
-        <w:rPr>
-          <w:rFonts w:ascii="Times New Roman" w:hAnsi="Times New Roman" w:cs="Times New Roman"/>
-        </w:rPr>
-        <w:t>-friction confirmation. As shown in the diagram, a simple button press is insufficient; the user must re-authenticate:</w:t>
+        <w:t>To prevent accidental data loss, the account deletion process requires a high-friction confirmation. As shown in the diagram, a simple button press is insufficient; the user must re-authenticate:</w:t>
       </w:r>
     </w:p>
     <w:p>
@@ -676,10 +588,7 @@
     </w:p>
     <w:p>
       <w:pPr>
-        <w:numPr>
-          <w:ilvl w:val="0"/>
-          <w:numId w:val="16"/>
-        </w:numPr>
+        <w:ind w:left="360"/>
         <w:rPr>
           <w:rFonts w:ascii="Times New Roman" w:hAnsi="Times New Roman" w:cs="Times New Roman"/>
         </w:rPr>
@@ -742,33 +651,11 @@
           <w:rFonts w:ascii="Times New Roman" w:hAnsi="Times New Roman" w:cs="Times New Roman"/>
         </w:rPr>
       </w:pPr>
-      <w:proofErr w:type="gramStart"/>
-      <w:r>
-        <w:rPr>
-          <w:rFonts w:ascii="Times New Roman" w:hAnsi="Times New Roman" w:cs="Times New Roman"/>
-        </w:rPr>
-        <w:t>This use</w:t>
-      </w:r>
-      <w:proofErr w:type="gramEnd"/>
-      <w:r>
-        <w:rPr>
-          <w:rFonts w:ascii="Times New Roman" w:hAnsi="Times New Roman" w:cs="Times New Roman"/>
-        </w:rPr>
-        <w:t xml:space="preserve"> case describes the process by which a service provider (Mechanic) creates a new account within the </w:t>
-      </w:r>
-      <w:proofErr w:type="spellStart"/>
-      <w:r>
-        <w:rPr>
-          <w:rFonts w:ascii="Times New Roman" w:hAnsi="Times New Roman" w:cs="Times New Roman"/>
-        </w:rPr>
-        <w:t>MyMechanic</w:t>
-      </w:r>
-      <w:proofErr w:type="spellEnd"/>
-      <w:r>
-        <w:rPr>
-          <w:rFonts w:ascii="Times New Roman" w:hAnsi="Times New Roman" w:cs="Times New Roman"/>
-        </w:rPr>
-        <w:t xml:space="preserve"> application. The process distinguishes between critical identity information required for authentication and supplementary profile details used for business listing.</w:t>
+      <w:r>
+        <w:rPr>
+          <w:rFonts w:ascii="Times New Roman" w:hAnsi="Times New Roman" w:cs="Times New Roman"/>
+        </w:rPr>
+        <w:t>This use case describes the process by which a service provider (Mechanic) creates a new account within the MyMechanic application. The process distinguishes between critical identity information required for authentication and supplementary profile details used for business listing.</w:t>
       </w:r>
     </w:p>
     <w:p>
@@ -1340,19 +1227,11 @@
           <w:rFonts w:ascii="Times New Roman" w:hAnsi="Times New Roman" w:cs="Times New Roman"/>
         </w:rPr>
       </w:pPr>
-      <w:proofErr w:type="gramStart"/>
-      <w:r>
-        <w:rPr>
-          <w:rFonts w:ascii="Times New Roman" w:hAnsi="Times New Roman" w:cs="Times New Roman"/>
-        </w:rPr>
-        <w:t>This use</w:t>
-      </w:r>
-      <w:proofErr w:type="gramEnd"/>
-      <w:r>
-        <w:rPr>
-          <w:rFonts w:ascii="Times New Roman" w:hAnsi="Times New Roman" w:cs="Times New Roman"/>
-        </w:rPr>
-        <w:t xml:space="preserve"> case describes the mechanic's ability to monitor and manage their digital storefront. Upon accessing the main dashboard, the mechanic can view their public-facing shop profile and perform administrative updates.</w:t>
+      <w:r>
+        <w:rPr>
+          <w:rFonts w:ascii="Times New Roman" w:hAnsi="Times New Roman" w:cs="Times New Roman"/>
+        </w:rPr>
+        <w:t>This use case describes the mechanic's ability to monitor and manage their digital storefront. Upon accessing the main dashboard, the mechanic can view their public-facing shop profile and perform administrative updates.</w:t>
       </w:r>
     </w:p>
     <w:p>
@@ -1568,21 +1447,7 @@
         <w:rPr>
           <w:rFonts w:ascii="Times New Roman" w:hAnsi="Times New Roman" w:cs="Times New Roman"/>
         </w:rPr>
-        <w:t>From the dashboard, the user accesses the "View Shop" interface. This action triggers the retrieval of several mandatory data points (&lt;&lt;</w:t>
-      </w:r>
-      <w:proofErr w:type="gramStart"/>
-      <w:r>
-        <w:rPr>
-          <w:rFonts w:ascii="Times New Roman" w:hAnsi="Times New Roman" w:cs="Times New Roman"/>
-        </w:rPr>
-        <w:t>include</w:t>
-      </w:r>
-      <w:proofErr w:type="gramEnd"/>
-      <w:r>
-        <w:rPr>
-          <w:rFonts w:ascii="Times New Roman" w:hAnsi="Times New Roman" w:cs="Times New Roman"/>
-        </w:rPr>
-        <w:t>&gt;&gt;):</w:t>
+        <w:t>From the dashboard, the user accesses the "View Shop" interface. This action triggers the retrieval of several mandatory data points (&lt;&lt;include&gt;&gt;):</w:t>
       </w:r>
     </w:p>
     <w:p>
@@ -1657,21 +1522,7 @@
         <w:rPr>
           <w:rFonts w:ascii="Times New Roman" w:hAnsi="Times New Roman" w:cs="Times New Roman"/>
         </w:rPr>
-        <w:t xml:space="preserve"> The system aggregates and displays the average star rating and recent customer comments to help the </w:t>
-      </w:r>
-      <w:proofErr w:type="gramStart"/>
-      <w:r>
-        <w:rPr>
-          <w:rFonts w:ascii="Times New Roman" w:hAnsi="Times New Roman" w:cs="Times New Roman"/>
-        </w:rPr>
-        <w:t>mechanic</w:t>
-      </w:r>
-      <w:proofErr w:type="gramEnd"/>
-      <w:r>
-        <w:rPr>
-          <w:rFonts w:ascii="Times New Roman" w:hAnsi="Times New Roman" w:cs="Times New Roman"/>
-        </w:rPr>
-        <w:t xml:space="preserve"> track performance.</w:t>
+        <w:t xml:space="preserve"> The system aggregates and displays the average star rating and recent customer comments to help the mechanic track performance.</w:t>
       </w:r>
     </w:p>
     <w:p>
@@ -1766,19 +1617,11 @@
           <w:rFonts w:ascii="Times New Roman" w:hAnsi="Times New Roman" w:cs="Times New Roman"/>
         </w:rPr>
       </w:pPr>
-      <w:proofErr w:type="gramStart"/>
-      <w:r>
-        <w:rPr>
-          <w:rFonts w:ascii="Times New Roman" w:hAnsi="Times New Roman" w:cs="Times New Roman"/>
-        </w:rPr>
-        <w:t>This use</w:t>
-      </w:r>
-      <w:proofErr w:type="gramEnd"/>
-      <w:r>
-        <w:rPr>
-          <w:rFonts w:ascii="Times New Roman" w:hAnsi="Times New Roman" w:cs="Times New Roman"/>
-        </w:rPr>
-        <w:t xml:space="preserve"> case specifies the modification capabilities available to the Mechanic. It allows the service provider to keep their business information current, ensuring customers see accurate pricing, contact details, and service availability.</w:t>
+      <w:r>
+        <w:rPr>
+          <w:rFonts w:ascii="Times New Roman" w:hAnsi="Times New Roman" w:cs="Times New Roman"/>
+        </w:rPr>
+        <w:t>This use case specifies the modification capabilities available to the Mechanic. It allows the service provider to keep their business information current, ensuring customers see accurate pricing, contact details, and service availability.</w:t>
       </w:r>
     </w:p>
     <w:p>
@@ -2505,21 +2348,7 @@
         <w:rPr>
           <w:rFonts w:ascii="Times New Roman" w:hAnsi="Times New Roman" w:cs="Times New Roman"/>
         </w:rPr>
-        <w:t xml:space="preserve"> </w:t>
-      </w:r>
-      <w:proofErr w:type="gramStart"/>
-      <w:r>
-        <w:rPr>
-          <w:rFonts w:ascii="Times New Roman" w:hAnsi="Times New Roman" w:cs="Times New Roman"/>
-        </w:rPr>
-        <w:t>Displays jobs</w:t>
-      </w:r>
-      <w:proofErr w:type="gramEnd"/>
-      <w:r>
-        <w:rPr>
-          <w:rFonts w:ascii="Times New Roman" w:hAnsi="Times New Roman" w:cs="Times New Roman"/>
-        </w:rPr>
-        <w:t xml:space="preserve"> where all parties are ready, parts are ordered, or work is effectively locked in.</w:t>
+        <w:t xml:space="preserve"> Displays jobs where all parties are ready, parts are ordered, or work is effectively locked in.</w:t>
       </w:r>
     </w:p>
     <w:p>
@@ -3232,21 +3061,7 @@
         <w:rPr>
           <w:rFonts w:ascii="Times New Roman" w:hAnsi="Times New Roman" w:cs="Times New Roman"/>
         </w:rPr>
-        <w:t xml:space="preserve"> The system requires a valid email address to serve as the user's login credential and for </w:t>
-      </w:r>
-      <w:proofErr w:type="gramStart"/>
-      <w:r>
-        <w:rPr>
-          <w:rFonts w:ascii="Times New Roman" w:hAnsi="Times New Roman" w:cs="Times New Roman"/>
-        </w:rPr>
-        <w:t>receiving booking</w:t>
-      </w:r>
-      <w:proofErr w:type="gramEnd"/>
-      <w:r>
-        <w:rPr>
-          <w:rFonts w:ascii="Times New Roman" w:hAnsi="Times New Roman" w:cs="Times New Roman"/>
-        </w:rPr>
-        <w:t xml:space="preserve"> confirmations.</w:t>
+        <w:t xml:space="preserve"> The system requires a valid email address to serve as the user's login credential and for receiving booking confirmations.</w:t>
       </w:r>
     </w:p>
     <w:p>
@@ -3564,21 +3379,7 @@
         <w:rPr>
           <w:rFonts w:ascii="Times New Roman" w:hAnsi="Times New Roman" w:cs="Times New Roman"/>
         </w:rPr>
-        <w:t xml:space="preserve"> Java XML parsers (</w:t>
-      </w:r>
-      <w:proofErr w:type="spellStart"/>
-      <w:r>
-        <w:rPr>
-          <w:rFonts w:ascii="Times New Roman" w:hAnsi="Times New Roman" w:cs="Times New Roman"/>
-        </w:rPr>
-        <w:t>DocumentBuilderFactory</w:t>
-      </w:r>
-      <w:proofErr w:type="spellEnd"/>
-      <w:r>
-        <w:rPr>
-          <w:rFonts w:ascii="Times New Roman" w:hAnsi="Times New Roman" w:cs="Times New Roman"/>
-        </w:rPr>
-        <w:t>).</w:t>
+        <w:t xml:space="preserve"> Java XML parsers (DocumentBuilderFactory).</w:t>
       </w:r>
     </w:p>
     <w:p>
@@ -3701,43 +3502,6 @@
           <w:szCs w:val="28"/>
         </w:rPr>
       </w:pPr>
-    </w:p>
-    <w:p>
-      <w:pPr>
-        <w:pStyle w:val="ListParagraph"/>
-        <w:numPr>
-          <w:ilvl w:val="0"/>
-          <w:numId w:val="12"/>
-        </w:numPr>
-        <w:rPr>
-          <w:rFonts w:ascii="Times New Roman" w:hAnsi="Times New Roman" w:cs="Times New Roman"/>
-          <w:b/>
-          <w:bCs/>
-          <w:sz w:val="28"/>
-          <w:szCs w:val="28"/>
-        </w:rPr>
-      </w:pPr>
-      <w:r>
-        <w:rPr>
-          <w:rFonts w:ascii="Times New Roman" w:hAnsi="Times New Roman" w:cs="Times New Roman"/>
-          <w:b/>
-          <w:bCs/>
-          <w:sz w:val="28"/>
-          <w:szCs w:val="28"/>
-        </w:rPr>
-        <w:t>UML Class Diagrams</w:t>
-      </w:r>
-    </w:p>
-    <w:p>
-      <w:pPr>
-        <w:rPr>
-          <w:rFonts w:ascii="Times New Roman" w:hAnsi="Times New Roman" w:cs="Times New Roman"/>
-          <w:b/>
-          <w:bCs/>
-          <w:sz w:val="28"/>
-          <w:szCs w:val="28"/>
-        </w:rPr>
-      </w:pPr>
       <w:r>
         <w:rPr>
           <w:rFonts w:ascii="Times New Roman" w:hAnsi="Times New Roman" w:cs="Times New Roman"/>
@@ -3747,11 +3511,99 @@
           <w:sz w:val="28"/>
           <w:szCs w:val="28"/>
         </w:rPr>
+        <w:lastRenderedPageBreak/>
+        <mc:AlternateContent>
+          <mc:Choice Requires="wps">
+            <w:drawing>
+              <wp:anchor distT="0" distB="0" distL="114300" distR="114300" simplePos="0" relativeHeight="251660288" behindDoc="0" locked="0" layoutInCell="1" allowOverlap="1" wp14:anchorId="574A5DBE" wp14:editId="515AED9C">
+                <wp:simplePos x="0" y="0"/>
+                <wp:positionH relativeFrom="margin">
+                  <wp:posOffset>6407524</wp:posOffset>
+                </wp:positionH>
+                <wp:positionV relativeFrom="paragraph">
+                  <wp:posOffset>3280485</wp:posOffset>
+                </wp:positionV>
+                <wp:extent cx="484094" cy="484094"/>
+                <wp:effectExtent l="0" t="0" r="11430" b="11430"/>
+                <wp:wrapNone/>
+                <wp:docPr id="1941550332" name="Flowchart: Connector 4"/>
+                <wp:cNvGraphicFramePr/>
+                <a:graphic xmlns:a="http://schemas.openxmlformats.org/drawingml/2006/main">
+                  <a:graphicData uri="http://schemas.microsoft.com/office/word/2010/wordprocessingShape">
+                    <wps:wsp>
+                      <wps:cNvSpPr/>
+                      <wps:spPr>
+                        <a:xfrm>
+                          <a:off x="0" y="0"/>
+                          <a:ext cx="484094" cy="484094"/>
+                        </a:xfrm>
+                        <a:prstGeom prst="flowChartConnector">
+                          <a:avLst/>
+                        </a:prstGeom>
+                        <a:solidFill>
+                          <a:schemeClr val="bg1"/>
+                        </a:solidFill>
+                        <a:ln>
+                          <a:solidFill>
+                            <a:schemeClr val="bg1"/>
+                          </a:solidFill>
+                        </a:ln>
+                      </wps:spPr>
+                      <wps:style>
+                        <a:lnRef idx="2">
+                          <a:schemeClr val="accent1">
+                            <a:shade val="15000"/>
+                          </a:schemeClr>
+                        </a:lnRef>
+                        <a:fillRef idx="1">
+                          <a:schemeClr val="accent1"/>
+                        </a:fillRef>
+                        <a:effectRef idx="0">
+                          <a:schemeClr val="accent1"/>
+                        </a:effectRef>
+                        <a:fontRef idx="minor">
+                          <a:schemeClr val="lt1"/>
+                        </a:fontRef>
+                      </wps:style>
+                      <wps:bodyPr rot="0" spcFirstLastPara="0" vertOverflow="overflow" horzOverflow="overflow" vert="horz" wrap="square" lIns="91440" tIns="45720" rIns="91440" bIns="45720" numCol="1" spcCol="0" rtlCol="0" fromWordArt="0" anchor="ctr" anchorCtr="0" forceAA="0" compatLnSpc="1">
+                        <a:prstTxWarp prst="textNoShape">
+                          <a:avLst/>
+                        </a:prstTxWarp>
+                        <a:noAutofit/>
+                      </wps:bodyPr>
+                    </wps:wsp>
+                  </a:graphicData>
+                </a:graphic>
+              </wp:anchor>
+            </w:drawing>
+          </mc:Choice>
+          <mc:Fallback>
+            <w:pict>
+              <v:shapetype w14:anchorId="161A0CDD" id="_x0000_t120" coordsize="21600,21600" o:spt="120" path="m10800,qx,10800,10800,21600,21600,10800,10800,xe">
+                <v:path gradientshapeok="t" o:connecttype="custom" o:connectlocs="10800,0;3163,3163;0,10800;3163,18437;10800,21600;18437,18437;21600,10800;18437,3163" textboxrect="3163,3163,18437,18437"/>
+              </v:shapetype>
+              <v:shape id="Flowchart: Connector 4" o:spid="_x0000_s1026" type="#_x0000_t120" style="position:absolute;margin-left:504.55pt;margin-top:258.3pt;width:38.1pt;height:38.1pt;z-index:251660288;visibility:visible;mso-wrap-style:square;mso-wrap-distance-left:9pt;mso-wrap-distance-top:0;mso-wrap-distance-right:9pt;mso-wrap-distance-bottom:0;mso-position-horizontal:absolute;mso-position-horizontal-relative:margin;mso-position-vertical:absolute;mso-position-vertical-relative:text;v-text-anchor:middle" o:gfxdata="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" fillcolor="white [3212]" strokecolor="white [3212]" strokeweight="1.5pt">
+                <v:stroke joinstyle="miter"/>
+                <w10:wrap anchorx="margin"/>
+              </v:shape>
+            </w:pict>
+          </mc:Fallback>
+        </mc:AlternateContent>
+      </w:r>
+      <w:r>
+        <w:rPr>
+          <w:rFonts w:ascii="Times New Roman" w:hAnsi="Times New Roman" w:cs="Times New Roman"/>
+          <w:b/>
+          <w:bCs/>
+          <w:noProof/>
+          <w:sz w:val="28"/>
+          <w:szCs w:val="28"/>
+        </w:rPr>
         <w:drawing>
-          <wp:inline distT="0" distB="0" distL="0" distR="0" wp14:anchorId="2CD81FA8" wp14:editId="027E2EE3">
+          <wp:inline distT="0" distB="0" distL="0" distR="0" wp14:anchorId="19F8BCCE" wp14:editId="3DE6E6C5">
             <wp:extent cx="6849110" cy="3738245"/>
             <wp:effectExtent l="0" t="0" r="8890" b="0"/>
-            <wp:docPr id="735286089" name="Picture 3"/>
+            <wp:docPr id="1140753643" name="Picture 1"/>
             <wp:cNvGraphicFramePr>
               <a:graphicFrameLocks xmlns:a="http://schemas.openxmlformats.org/drawingml/2006/main" noChangeAspect="1"/>
             </wp:cNvGraphicFramePr>
@@ -3759,7 +3611,7 @@
               <a:graphicData uri="http://schemas.openxmlformats.org/drawingml/2006/picture">
                 <pic:pic xmlns:pic="http://schemas.openxmlformats.org/drawingml/2006/picture">
                   <pic:nvPicPr>
-                    <pic:cNvPr id="0" name="Picture 6"/>
+                    <pic:cNvPr id="0" name="Picture 3"/>
                     <pic:cNvPicPr>
                       <a:picLocks noChangeAspect="1" noChangeArrowheads="1"/>
                     </pic:cNvPicPr>
@@ -3819,6 +3671,123 @@
           <w:rFonts w:ascii="Times New Roman" w:hAnsi="Times New Roman" w:cs="Times New Roman"/>
           <w:b/>
           <w:bCs/>
+          <w:sz w:val="28"/>
+          <w:szCs w:val="28"/>
+        </w:rPr>
+      </w:pPr>
+      <w:r>
+        <w:rPr>
+          <w:rFonts w:ascii="Times New Roman" w:hAnsi="Times New Roman" w:cs="Times New Roman"/>
+          <w:b/>
+          <w:bCs/>
+          <w:sz w:val="28"/>
+          <w:szCs w:val="28"/>
+        </w:rPr>
+        <w:t>UML Class Diagrams</w:t>
+      </w:r>
+    </w:p>
+    <w:p>
+      <w:pPr>
+        <w:rPr>
+          <w:rFonts w:ascii="Times New Roman" w:hAnsi="Times New Roman" w:cs="Times New Roman"/>
+          <w:b/>
+          <w:bCs/>
+          <w:sz w:val="28"/>
+          <w:szCs w:val="28"/>
+        </w:rPr>
+      </w:pPr>
+      <w:r>
+        <w:rPr>
+          <w:rFonts w:ascii="Times New Roman" w:hAnsi="Times New Roman" w:cs="Times New Roman"/>
+          <w:b/>
+          <w:bCs/>
+          <w:noProof/>
+          <w:sz w:val="28"/>
+          <w:szCs w:val="28"/>
+        </w:rPr>
+        <w:drawing>
+          <wp:inline distT="0" distB="0" distL="0" distR="0" wp14:anchorId="161AB7EB" wp14:editId="7DDC6A8C">
+            <wp:extent cx="6849110" cy="3738245"/>
+            <wp:effectExtent l="0" t="0" r="8890" b="0"/>
+            <wp:docPr id="561002994" name="Picture 6"/>
+            <wp:cNvGraphicFramePr>
+              <a:graphicFrameLocks xmlns:a="http://schemas.openxmlformats.org/drawingml/2006/main" noChangeAspect="1"/>
+            </wp:cNvGraphicFramePr>
+            <a:graphic xmlns:a="http://schemas.openxmlformats.org/drawingml/2006/main">
+              <a:graphicData uri="http://schemas.openxmlformats.org/drawingml/2006/picture">
+                <pic:pic xmlns:pic="http://schemas.openxmlformats.org/drawingml/2006/picture">
+                  <pic:nvPicPr>
+                    <pic:cNvPr id="0" name="Picture 7"/>
+                    <pic:cNvPicPr>
+                      <a:picLocks noChangeAspect="1" noChangeArrowheads="1"/>
+                    </pic:cNvPicPr>
+                  </pic:nvPicPr>
+                  <pic:blipFill>
+                    <a:blip r:embed="rId13" cstate="print">
+                      <a:extLst>
+                        <a:ext uri="{28A0092B-C50C-407E-A947-70E740481C1C}">
+                          <a14:useLocalDpi xmlns:a14="http://schemas.microsoft.com/office/drawing/2010/main" val="0"/>
+                        </a:ext>
+                      </a:extLst>
+                    </a:blip>
+                    <a:srcRect/>
+                    <a:stretch>
+                      <a:fillRect/>
+                    </a:stretch>
+                  </pic:blipFill>
+                  <pic:spPr bwMode="auto">
+                    <a:xfrm>
+                      <a:off x="0" y="0"/>
+                      <a:ext cx="6849110" cy="3738245"/>
+                    </a:xfrm>
+                    <a:prstGeom prst="rect">
+                      <a:avLst/>
+                    </a:prstGeom>
+                    <a:noFill/>
+                    <a:ln>
+                      <a:noFill/>
+                    </a:ln>
+                  </pic:spPr>
+                </pic:pic>
+              </a:graphicData>
+            </a:graphic>
+          </wp:inline>
+        </w:drawing>
+      </w:r>
+    </w:p>
+    <w:p>
+      <w:pPr>
+        <w:rPr>
+          <w:rFonts w:ascii="Times New Roman" w:hAnsi="Times New Roman" w:cs="Times New Roman"/>
+          <w:b/>
+          <w:bCs/>
+          <w:sz w:val="28"/>
+          <w:szCs w:val="28"/>
+        </w:rPr>
+      </w:pPr>
+    </w:p>
+    <w:p>
+      <w:pPr>
+        <w:rPr>
+          <w:rFonts w:ascii="Times New Roman" w:hAnsi="Times New Roman" w:cs="Times New Roman"/>
+          <w:b/>
+          <w:bCs/>
+          <w:sz w:val="28"/>
+          <w:szCs w:val="28"/>
+        </w:rPr>
+      </w:pPr>
+    </w:p>
+    <w:p>
+      <w:pPr>
+        <w:pStyle w:val="ListParagraph"/>
+        <w:numPr>
+          <w:ilvl w:val="0"/>
+          <w:numId w:val="12"/>
+        </w:numPr>
+        <w:rPr>
+          <w:rFonts w:ascii="Times New Roman" w:hAnsi="Times New Roman" w:cs="Times New Roman"/>
+          <w:b/>
+          <w:bCs/>
           <w:sz w:val="32"/>
           <w:szCs w:val="32"/>
         </w:rPr>
@@ -3831,6 +3800,7 @@
           <w:sz w:val="32"/>
           <w:szCs w:val="32"/>
         </w:rPr>
+        <w:lastRenderedPageBreak/>
         <w:t>UML Sequence diagrams</w:t>
       </w:r>
     </w:p>
@@ -3885,11 +3855,10 @@
           <w:sz w:val="32"/>
           <w:szCs w:val="32"/>
         </w:rPr>
-        <w:lastRenderedPageBreak/>
         <w:drawing>
-          <wp:inline distT="0" distB="0" distL="0" distR="0" wp14:anchorId="2D5EA753" wp14:editId="3F507E16">
-            <wp:extent cx="3114713" cy="4159698"/>
-            <wp:effectExtent l="0" t="0" r="0" b="0"/>
+          <wp:inline distT="0" distB="0" distL="0" distR="0" wp14:anchorId="2D5EA753" wp14:editId="43B47C33">
+            <wp:extent cx="3081094" cy="4114800"/>
+            <wp:effectExtent l="0" t="0" r="5080" b="0"/>
             <wp:docPr id="459740928" name="Picture 7"/>
             <wp:cNvGraphicFramePr>
               <a:graphicFrameLocks xmlns:a="http://schemas.openxmlformats.org/drawingml/2006/main" noChangeAspect="1"/>
@@ -3904,7 +3873,7 @@
                     </pic:cNvPicPr>
                   </pic:nvPicPr>
                   <pic:blipFill>
-                    <a:blip r:embed="rId13">
+                    <a:blip r:embed="rId14">
                       <a:extLst>
                         <a:ext uri="{28A0092B-C50C-407E-A947-70E740481C1C}">
                           <a14:useLocalDpi xmlns:a14="http://schemas.microsoft.com/office/drawing/2010/main" val="0"/>
@@ -3919,7 +3888,7 @@
                   <pic:spPr bwMode="auto">
                     <a:xfrm>
                       <a:off x="0" y="0"/>
-                      <a:ext cx="3124061" cy="4172182"/>
+                      <a:ext cx="3110081" cy="4153512"/>
                     </a:xfrm>
                     <a:prstGeom prst="rect">
                       <a:avLst/>
@@ -3977,11 +3946,10 @@
           <w:sz w:val="32"/>
           <w:szCs w:val="32"/>
         </w:rPr>
-        <w:lastRenderedPageBreak/>
         <w:drawing>
-          <wp:inline distT="0" distB="0" distL="0" distR="0" wp14:anchorId="391020D8" wp14:editId="7D73186F">
-            <wp:extent cx="3490621" cy="4661722"/>
-            <wp:effectExtent l="0" t="0" r="0" b="5715"/>
+          <wp:inline distT="0" distB="0" distL="0" distR="0" wp14:anchorId="391020D8" wp14:editId="2D39DC3E">
+            <wp:extent cx="2804911" cy="3745957"/>
+            <wp:effectExtent l="0" t="0" r="0" b="6985"/>
             <wp:docPr id="960979668" name="Picture 6"/>
             <wp:cNvGraphicFramePr>
               <a:graphicFrameLocks xmlns:a="http://schemas.openxmlformats.org/drawingml/2006/main" noChangeAspect="1"/>
@@ -3996,7 +3964,7 @@
                     </pic:cNvPicPr>
                   </pic:nvPicPr>
                   <pic:blipFill>
-                    <a:blip r:embed="rId13">
+                    <a:blip r:embed="rId15" cstate="print">
                       <a:extLst>
                         <a:ext uri="{28A0092B-C50C-407E-A947-70E740481C1C}">
                           <a14:useLocalDpi xmlns:a14="http://schemas.microsoft.com/office/drawing/2010/main" val="0"/>
@@ -4011,7 +3979,7 @@
                   <pic:spPr bwMode="auto">
                     <a:xfrm>
                       <a:off x="0" y="0"/>
-                      <a:ext cx="3494265" cy="4666588"/>
+                      <a:ext cx="2813296" cy="3757156"/>
                     </a:xfrm>
                     <a:prstGeom prst="rect">
                       <a:avLst/>
@@ -4034,151 +4002,8 @@
           <w:rFonts w:ascii="Times New Roman" w:hAnsi="Times New Roman" w:cs="Times New Roman"/>
           <w:b/>
           <w:bCs/>
-          <w:sz w:val="28"/>
-          <w:szCs w:val="28"/>
-        </w:rPr>
-      </w:pPr>
-    </w:p>
-    <w:p>
-      <w:pPr>
-        <w:rPr>
-          <w:rFonts w:ascii="Times New Roman" w:hAnsi="Times New Roman" w:cs="Times New Roman"/>
-          <w:b/>
-          <w:bCs/>
-          <w:sz w:val="28"/>
-          <w:szCs w:val="28"/>
-        </w:rPr>
-      </w:pPr>
-    </w:p>
-    <w:p>
-      <w:pPr>
-        <w:rPr>
-          <w:rFonts w:ascii="Times New Roman" w:hAnsi="Times New Roman" w:cs="Times New Roman"/>
-          <w:b/>
-          <w:bCs/>
-          <w:sz w:val="28"/>
-          <w:szCs w:val="28"/>
-        </w:rPr>
-      </w:pPr>
-    </w:p>
-    <w:p>
-      <w:pPr>
-        <w:rPr>
-          <w:rFonts w:ascii="Times New Roman" w:hAnsi="Times New Roman" w:cs="Times New Roman"/>
-          <w:b/>
-          <w:bCs/>
-          <w:sz w:val="28"/>
-          <w:szCs w:val="28"/>
-        </w:rPr>
-      </w:pPr>
-    </w:p>
-    <w:p>
-      <w:pPr>
-        <w:rPr>
-          <w:rFonts w:ascii="Times New Roman" w:hAnsi="Times New Roman" w:cs="Times New Roman"/>
-          <w:b/>
-          <w:bCs/>
-          <w:sz w:val="28"/>
-          <w:szCs w:val="28"/>
-        </w:rPr>
-      </w:pPr>
-    </w:p>
-    <w:p>
-      <w:pPr>
-        <w:rPr>
-          <w:rFonts w:ascii="Times New Roman" w:hAnsi="Times New Roman" w:cs="Times New Roman"/>
-          <w:b/>
-          <w:bCs/>
-          <w:sz w:val="28"/>
-          <w:szCs w:val="28"/>
-        </w:rPr>
-      </w:pPr>
-    </w:p>
-    <w:p>
-      <w:pPr>
-        <w:rPr>
-          <w:rFonts w:ascii="Times New Roman" w:hAnsi="Times New Roman" w:cs="Times New Roman"/>
-          <w:b/>
-          <w:bCs/>
-          <w:sz w:val="28"/>
-          <w:szCs w:val="28"/>
-        </w:rPr>
-      </w:pPr>
-    </w:p>
-    <w:p>
-      <w:pPr>
-        <w:rPr>
-          <w:rFonts w:ascii="Times New Roman" w:hAnsi="Times New Roman" w:cs="Times New Roman"/>
-          <w:b/>
-          <w:bCs/>
-          <w:sz w:val="28"/>
-          <w:szCs w:val="28"/>
-        </w:rPr>
-      </w:pPr>
-    </w:p>
-    <w:p>
-      <w:pPr>
-        <w:rPr>
-          <w:rFonts w:ascii="Times New Roman" w:hAnsi="Times New Roman" w:cs="Times New Roman"/>
-          <w:b/>
-          <w:bCs/>
-          <w:sz w:val="28"/>
-          <w:szCs w:val="28"/>
-        </w:rPr>
-      </w:pPr>
-    </w:p>
-    <w:p>
-      <w:pPr>
-        <w:rPr>
-          <w:rFonts w:ascii="Times New Roman" w:hAnsi="Times New Roman" w:cs="Times New Roman"/>
-          <w:b/>
-          <w:bCs/>
-          <w:sz w:val="28"/>
-          <w:szCs w:val="28"/>
-        </w:rPr>
-      </w:pPr>
-    </w:p>
-    <w:p>
-      <w:pPr>
-        <w:rPr>
-          <w:rFonts w:ascii="Times New Roman" w:hAnsi="Times New Roman" w:cs="Times New Roman"/>
-          <w:b/>
-          <w:bCs/>
-          <w:sz w:val="28"/>
-          <w:szCs w:val="28"/>
-        </w:rPr>
-      </w:pPr>
-    </w:p>
-    <w:p>
-      <w:pPr>
-        <w:rPr>
-          <w:rFonts w:ascii="Times New Roman" w:hAnsi="Times New Roman" w:cs="Times New Roman"/>
-          <w:b/>
-          <w:bCs/>
-          <w:sz w:val="28"/>
-          <w:szCs w:val="28"/>
-        </w:rPr>
-      </w:pPr>
-    </w:p>
-    <w:p>
-      <w:pPr>
-        <w:rPr>
-          <w:rFonts w:ascii="Times New Roman" w:hAnsi="Times New Roman" w:cs="Times New Roman"/>
-          <w:b/>
-          <w:bCs/>
-          <w:sz w:val="28"/>
-          <w:szCs w:val="28"/>
-        </w:rPr>
-      </w:pPr>
-    </w:p>
-    <w:p>
-      <w:pPr>
-        <w:rPr>
-          <w:rFonts w:ascii="Times New Roman" w:hAnsi="Times New Roman" w:cs="Times New Roman"/>
-          <w:b/>
-          <w:bCs/>
-          <w:sz w:val="28"/>
-          <w:szCs w:val="28"/>
+          <w:sz w:val="32"/>
+          <w:szCs w:val="32"/>
         </w:rPr>
       </w:pPr>
       <w:r>
@@ -4231,7 +4056,7 @@
                     </pic:cNvPicPr>
                   </pic:nvPicPr>
                   <pic:blipFill>
-                    <a:blip r:embed="rId14">
+                    <a:blip r:embed="rId16">
                       <a:extLst>
                         <a:ext uri="{28A0092B-C50C-407E-A947-70E740481C1C}">
                           <a14:useLocalDpi xmlns:a14="http://schemas.microsoft.com/office/drawing/2010/main" val="0"/>
@@ -4306,7 +4131,7 @@
           <w:szCs w:val="28"/>
         </w:rPr>
         <w:drawing>
-          <wp:inline distT="0" distB="0" distL="0" distR="0" wp14:anchorId="3D090932" wp14:editId="64B8BF5F">
+          <wp:inline distT="0" distB="0" distL="0" distR="0" wp14:anchorId="3D090932" wp14:editId="17BB0321">
             <wp:extent cx="3450642" cy="4876800"/>
             <wp:effectExtent l="0" t="0" r="0" b="0"/>
             <wp:docPr id="1087513635" name="Picture 4"/>
@@ -4323,7 +4148,7 @@
                     </pic:cNvPicPr>
                   </pic:nvPicPr>
                   <pic:blipFill>
-                    <a:blip r:embed="rId15" cstate="print">
+                    <a:blip r:embed="rId17" cstate="print">
                       <a:extLst>
                         <a:ext uri="{28A0092B-C50C-407E-A947-70E740481C1C}">
                           <a14:useLocalDpi xmlns:a14="http://schemas.microsoft.com/office/drawing/2010/main" val="0"/>
@@ -4365,7 +4190,9 @@
           <w:szCs w:val="28"/>
         </w:rPr>
       </w:pPr>
-      <w:r>
+    </w:p>
+    <w:p>
+      <w:pPr>
         <w:rPr>
           <w:rFonts w:ascii="Times New Roman" w:hAnsi="Times New Roman" w:cs="Times New Roman"/>
           <w:b/>
@@ -4373,6 +4200,126 @@
           <w:sz w:val="28"/>
           <w:szCs w:val="28"/>
         </w:rPr>
+      </w:pPr>
+    </w:p>
+    <w:p>
+      <w:pPr>
+        <w:rPr>
+          <w:rFonts w:ascii="Times New Roman" w:hAnsi="Times New Roman" w:cs="Times New Roman"/>
+          <w:b/>
+          <w:bCs/>
+          <w:sz w:val="28"/>
+          <w:szCs w:val="28"/>
+        </w:rPr>
+      </w:pPr>
+    </w:p>
+    <w:p>
+      <w:pPr>
+        <w:rPr>
+          <w:rFonts w:ascii="Times New Roman" w:hAnsi="Times New Roman" w:cs="Times New Roman"/>
+          <w:b/>
+          <w:bCs/>
+          <w:sz w:val="28"/>
+          <w:szCs w:val="28"/>
+        </w:rPr>
+      </w:pPr>
+    </w:p>
+    <w:p>
+      <w:pPr>
+        <w:rPr>
+          <w:rFonts w:ascii="Times New Roman" w:hAnsi="Times New Roman" w:cs="Times New Roman"/>
+          <w:b/>
+          <w:bCs/>
+          <w:sz w:val="28"/>
+          <w:szCs w:val="28"/>
+        </w:rPr>
+      </w:pPr>
+    </w:p>
+    <w:p>
+      <w:pPr>
+        <w:rPr>
+          <w:rFonts w:ascii="Times New Roman" w:hAnsi="Times New Roman" w:cs="Times New Roman"/>
+          <w:b/>
+          <w:bCs/>
+          <w:sz w:val="28"/>
+          <w:szCs w:val="28"/>
+        </w:rPr>
+      </w:pPr>
+    </w:p>
+    <w:p>
+      <w:pPr>
+        <w:rPr>
+          <w:rFonts w:ascii="Times New Roman" w:hAnsi="Times New Roman" w:cs="Times New Roman"/>
+          <w:b/>
+          <w:bCs/>
+          <w:sz w:val="28"/>
+          <w:szCs w:val="28"/>
+        </w:rPr>
+      </w:pPr>
+    </w:p>
+    <w:p>
+      <w:pPr>
+        <w:rPr>
+          <w:rFonts w:ascii="Times New Roman" w:hAnsi="Times New Roman" w:cs="Times New Roman"/>
+          <w:b/>
+          <w:bCs/>
+          <w:sz w:val="28"/>
+          <w:szCs w:val="28"/>
+        </w:rPr>
+      </w:pPr>
+    </w:p>
+    <w:p>
+      <w:pPr>
+        <w:rPr>
+          <w:rFonts w:ascii="Times New Roman" w:hAnsi="Times New Roman" w:cs="Times New Roman"/>
+          <w:b/>
+          <w:bCs/>
+          <w:sz w:val="28"/>
+          <w:szCs w:val="28"/>
+        </w:rPr>
+      </w:pPr>
+    </w:p>
+    <w:p>
+      <w:pPr>
+        <w:rPr>
+          <w:rFonts w:ascii="Times New Roman" w:hAnsi="Times New Roman" w:cs="Times New Roman"/>
+          <w:b/>
+          <w:bCs/>
+          <w:sz w:val="28"/>
+          <w:szCs w:val="28"/>
+        </w:rPr>
+      </w:pPr>
+    </w:p>
+    <w:p>
+      <w:pPr>
+        <w:rPr>
+          <w:rFonts w:ascii="Times New Roman" w:hAnsi="Times New Roman" w:cs="Times New Roman"/>
+          <w:b/>
+          <w:bCs/>
+          <w:sz w:val="28"/>
+          <w:szCs w:val="28"/>
+        </w:rPr>
+      </w:pPr>
+    </w:p>
+    <w:p>
+      <w:pPr>
+        <w:rPr>
+          <w:rFonts w:ascii="Times New Roman" w:hAnsi="Times New Roman" w:cs="Times New Roman"/>
+          <w:b/>
+          <w:bCs/>
+          <w:sz w:val="28"/>
+          <w:szCs w:val="28"/>
+        </w:rPr>
+      </w:pPr>
+      <w:r>
+        <w:rPr>
+          <w:rFonts w:ascii="Times New Roman" w:hAnsi="Times New Roman" w:cs="Times New Roman"/>
+          <w:b/>
+          <w:bCs/>
+          <w:sz w:val="28"/>
+          <w:szCs w:val="28"/>
+        </w:rPr>
+        <w:lastRenderedPageBreak/>
         <w:t>5.5 Mechanic Appointments</w:t>
       </w:r>
     </w:p>
@@ -4389,9 +4336,9 @@
           <w:noProof/>
         </w:rPr>
         <w:drawing>
-          <wp:inline distT="0" distB="0" distL="0" distR="0" wp14:anchorId="46537688" wp14:editId="1C81A81C">
-            <wp:extent cx="2805134" cy="3451411"/>
-            <wp:effectExtent l="0" t="0" r="0" b="0"/>
+          <wp:inline distT="0" distB="0" distL="0" distR="0" wp14:anchorId="46537688" wp14:editId="3FB7C005">
+            <wp:extent cx="3184009" cy="3917576"/>
+            <wp:effectExtent l="0" t="0" r="0" b="6985"/>
             <wp:docPr id="491693196" name="Picture 2"/>
             <wp:cNvGraphicFramePr>
               <a:graphicFrameLocks xmlns:a="http://schemas.openxmlformats.org/drawingml/2006/main" noChangeAspect="1"/>
@@ -4406,7 +4353,7 @@
                     </pic:cNvPicPr>
                   </pic:nvPicPr>
                   <pic:blipFill>
-                    <a:blip r:embed="rId16" cstate="print">
+                    <a:blip r:embed="rId18" cstate="print">
                       <a:extLst>
                         <a:ext uri="{28A0092B-C50C-407E-A947-70E740481C1C}">
                           <a14:useLocalDpi xmlns:a14="http://schemas.microsoft.com/office/drawing/2010/main" val="0"/>
@@ -4421,7 +4368,7 @@
                   <pic:spPr bwMode="auto">
                     <a:xfrm>
                       <a:off x="0" y="0"/>
-                      <a:ext cx="2817653" cy="3466814"/>
+                      <a:ext cx="3211583" cy="3951502"/>
                     </a:xfrm>
                     <a:prstGeom prst="rect">
                       <a:avLst/>
@@ -4452,7 +4399,6 @@
           <w:b/>
           <w:bCs/>
         </w:rPr>
-        <w:lastRenderedPageBreak/>
         <w:t>5.</w:t>
       </w:r>
       <w:r>
@@ -4477,9 +4423,9 @@
           <w:noProof/>
         </w:rPr>
         <w:drawing>
-          <wp:inline distT="0" distB="0" distL="0" distR="0" wp14:anchorId="1B6141EE" wp14:editId="06AAE250">
-            <wp:extent cx="3361765" cy="5067304"/>
-            <wp:effectExtent l="0" t="0" r="0" b="0"/>
+          <wp:inline distT="0" distB="0" distL="0" distR="0" wp14:anchorId="1B6141EE" wp14:editId="7FC084FE">
+            <wp:extent cx="2904565" cy="4378152"/>
+            <wp:effectExtent l="0" t="0" r="0" b="3810"/>
             <wp:docPr id="1544805189" name="Picture 1"/>
             <wp:cNvGraphicFramePr>
               <a:graphicFrameLocks xmlns:a="http://schemas.openxmlformats.org/drawingml/2006/main" noChangeAspect="1"/>
@@ -4494,7 +4440,7 @@
                     </pic:cNvPicPr>
                   </pic:nvPicPr>
                   <pic:blipFill>
-                    <a:blip r:embed="rId17" cstate="print">
+                    <a:blip r:embed="rId19" cstate="print">
                       <a:extLst>
                         <a:ext uri="{28A0092B-C50C-407E-A947-70E740481C1C}">
                           <a14:useLocalDpi xmlns:a14="http://schemas.microsoft.com/office/drawing/2010/main" val="0"/>
@@ -4509,7 +4455,7 @@
                   <pic:spPr bwMode="auto">
                     <a:xfrm>
                       <a:off x="0" y="0"/>
-                      <a:ext cx="3374140" cy="5085958"/>
+                      <a:ext cx="2933975" cy="4422483"/>
                     </a:xfrm>
                     <a:prstGeom prst="rect">
                       <a:avLst/>
@@ -4526,17 +4472,870 @@
         </w:drawing>
       </w:r>
     </w:p>
-    <w:p>
-      <w:pPr>
-        <w:rPr>
-          <w:rFonts w:ascii="Times New Roman" w:hAnsi="Times New Roman" w:cs="Times New Roman"/>
-          <w:b/>
-          <w:bCs/>
-          <w:sz w:val="28"/>
-          <w:szCs w:val="28"/>
-        </w:rPr>
-      </w:pPr>
-    </w:p>
+    <w:tbl>
+      <w:tblPr>
+        <w:tblStyle w:val="TableGrid"/>
+        <w:tblW w:w="0" w:type="auto"/>
+        <w:tblLook w:val="04A0" w:firstRow="1" w:lastRow="0" w:firstColumn="1" w:lastColumn="0" w:noHBand="0" w:noVBand="1"/>
+      </w:tblPr>
+      <w:tblGrid>
+        <w:gridCol w:w="5395"/>
+        <w:gridCol w:w="5395"/>
+      </w:tblGrid>
+      <w:tr>
+        <w:trPr>
+          <w:trHeight w:val="440"/>
+        </w:trPr>
+        <w:tc>
+          <w:tcPr>
+            <w:tcW w:w="5395" w:type="dxa"/>
+          </w:tcPr>
+          <w:p>
+            <w:pPr>
+              <w:rPr>
+                <w:rFonts w:ascii="Times New Roman" w:hAnsi="Times New Roman" w:cs="Times New Roman"/>
+                <w:b/>
+                <w:bCs/>
+              </w:rPr>
+            </w:pPr>
+            <w:r>
+              <w:rPr>
+                <w:rFonts w:ascii="Times New Roman" w:hAnsi="Times New Roman" w:cs="Times New Roman"/>
+                <w:b/>
+                <w:bCs/>
+              </w:rPr>
+              <w:lastRenderedPageBreak/>
+              <w:t>Interactions</w:t>
+            </w:r>
+          </w:p>
+        </w:tc>
+        <w:tc>
+          <w:tcPr>
+            <w:tcW w:w="5395" w:type="dxa"/>
+          </w:tcPr>
+          <w:p>
+            <w:pPr>
+              <w:rPr>
+                <w:rFonts w:ascii="Times New Roman" w:hAnsi="Times New Roman" w:cs="Times New Roman"/>
+                <w:b/>
+                <w:bCs/>
+              </w:rPr>
+            </w:pPr>
+            <w:r>
+              <w:rPr>
+                <w:rFonts w:ascii="Times New Roman" w:hAnsi="Times New Roman" w:cs="Times New Roman"/>
+                <w:b/>
+                <w:bCs/>
+              </w:rPr>
+              <w:t>Description</w:t>
+            </w:r>
+          </w:p>
+        </w:tc>
+      </w:tr>
+      <w:tr>
+        <w:trPr>
+          <w:trHeight w:val="3680"/>
+        </w:trPr>
+        <w:tc>
+          <w:tcPr>
+            <w:tcW w:w="5395" w:type="dxa"/>
+          </w:tcPr>
+          <w:p>
+            <w:pPr>
+              <w:rPr>
+                <w:rFonts w:ascii="Times New Roman" w:hAnsi="Times New Roman" w:cs="Times New Roman"/>
+              </w:rPr>
+            </w:pPr>
+          </w:p>
+          <w:p>
+            <w:pPr>
+              <w:rPr>
+                <w:rFonts w:ascii="Times New Roman" w:hAnsi="Times New Roman" w:cs="Times New Roman"/>
+              </w:rPr>
+            </w:pPr>
+          </w:p>
+          <w:p>
+            <w:pPr>
+              <w:rPr>
+                <w:rFonts w:ascii="Times New Roman" w:hAnsi="Times New Roman" w:cs="Times New Roman"/>
+              </w:rPr>
+            </w:pPr>
+          </w:p>
+          <w:p>
+            <w:pPr>
+              <w:rPr>
+                <w:rFonts w:ascii="Times New Roman" w:hAnsi="Times New Roman" w:cs="Times New Roman"/>
+              </w:rPr>
+            </w:pPr>
+          </w:p>
+          <w:p>
+            <w:pPr>
+              <w:rPr>
+                <w:rFonts w:ascii="Times New Roman" w:hAnsi="Times New Roman" w:cs="Times New Roman"/>
+              </w:rPr>
+            </w:pPr>
+          </w:p>
+          <w:p>
+            <w:pPr>
+              <w:rPr>
+                <w:rFonts w:ascii="Times New Roman" w:hAnsi="Times New Roman" w:cs="Times New Roman"/>
+              </w:rPr>
+            </w:pPr>
+          </w:p>
+          <w:p>
+            <w:pPr>
+              <w:rPr>
+                <w:rFonts w:ascii="Times New Roman" w:hAnsi="Times New Roman" w:cs="Times New Roman"/>
+              </w:rPr>
+            </w:pPr>
+            <w:r>
+              <w:rPr>
+                <w:rFonts w:ascii="Times New Roman" w:hAnsi="Times New Roman" w:cs="Times New Roman"/>
+              </w:rPr>
+              <w:t>Interaction 1: Mechanic Sign Up</w:t>
+            </w:r>
+          </w:p>
+        </w:tc>
+        <w:tc>
+          <w:tcPr>
+            <w:tcW w:w="5395" w:type="dxa"/>
+          </w:tcPr>
+          <w:p>
+            <w:pPr>
+              <w:rPr>
+                <w:rFonts w:ascii="Times New Roman" w:hAnsi="Times New Roman" w:cs="Times New Roman"/>
+              </w:rPr>
+            </w:pPr>
+            <w:r>
+              <w:rPr>
+                <w:rFonts w:ascii="Times New Roman" w:hAnsi="Times New Roman" w:cs="Times New Roman"/>
+              </w:rPr>
+              <w:t xml:space="preserve">The process begins when the Mechanic initiates the </w:t>
+            </w:r>
+            <w:r>
+              <w:rPr>
+                <w:rFonts w:ascii="Times New Roman" w:hAnsi="Times New Roman" w:cs="Times New Roman"/>
+                <w:b/>
+                <w:bCs/>
+              </w:rPr>
+              <w:t>Sign Up</w:t>
+            </w:r>
+            <w:r>
+              <w:rPr>
+                <w:rFonts w:ascii="Times New Roman" w:hAnsi="Times New Roman" w:cs="Times New Roman"/>
+              </w:rPr>
+              <w:t xml:space="preserve"> command from the system interface. As shown in the diagram, the system requires the user to input mandatory credentials, specifically their </w:t>
+            </w:r>
+            <w:r>
+              <w:rPr>
+                <w:rFonts w:ascii="Times New Roman" w:hAnsi="Times New Roman" w:cs="Times New Roman"/>
+                <w:b/>
+                <w:bCs/>
+              </w:rPr>
+              <w:t>Email</w:t>
+            </w:r>
+            <w:r>
+              <w:rPr>
+                <w:rFonts w:ascii="Times New Roman" w:hAnsi="Times New Roman" w:cs="Times New Roman"/>
+              </w:rPr>
+              <w:t xml:space="preserve">, </w:t>
+            </w:r>
+            <w:r>
+              <w:rPr>
+                <w:rFonts w:ascii="Times New Roman" w:hAnsi="Times New Roman" w:cs="Times New Roman"/>
+                <w:b/>
+                <w:bCs/>
+              </w:rPr>
+              <w:t>Password</w:t>
+            </w:r>
+            <w:r>
+              <w:rPr>
+                <w:rFonts w:ascii="Times New Roman" w:hAnsi="Times New Roman" w:cs="Times New Roman"/>
+              </w:rPr>
+              <w:t xml:space="preserve">, and </w:t>
+            </w:r>
+            <w:r>
+              <w:rPr>
+                <w:rFonts w:ascii="Times New Roman" w:hAnsi="Times New Roman" w:cs="Times New Roman"/>
+                <w:b/>
+                <w:bCs/>
+              </w:rPr>
+              <w:t>Phone Number</w:t>
+            </w:r>
+            <w:r>
+              <w:rPr>
+                <w:rFonts w:ascii="Times New Roman" w:hAnsi="Times New Roman" w:cs="Times New Roman"/>
+              </w:rPr>
+              <w:t xml:space="preserve">. Once the basic account structure is established, the interaction extends to allow the Mechanic to input professional details necessary for their business profile. This includes adding a </w:t>
+            </w:r>
+            <w:r>
+              <w:rPr>
+                <w:rFonts w:ascii="Times New Roman" w:hAnsi="Times New Roman" w:cs="Times New Roman"/>
+                <w:b/>
+                <w:bCs/>
+              </w:rPr>
+              <w:t>Business Name</w:t>
+            </w:r>
+            <w:r>
+              <w:rPr>
+                <w:rFonts w:ascii="Times New Roman" w:hAnsi="Times New Roman" w:cs="Times New Roman"/>
+              </w:rPr>
+              <w:t xml:space="preserve">, </w:t>
+            </w:r>
+            <w:r>
+              <w:rPr>
+                <w:rFonts w:ascii="Times New Roman" w:hAnsi="Times New Roman" w:cs="Times New Roman"/>
+                <w:b/>
+                <w:bCs/>
+              </w:rPr>
+              <w:t>Business Address</w:t>
+            </w:r>
+            <w:r>
+              <w:rPr>
+                <w:rFonts w:ascii="Times New Roman" w:hAnsi="Times New Roman" w:cs="Times New Roman"/>
+              </w:rPr>
+              <w:t xml:space="preserve">, </w:t>
+            </w:r>
+            <w:r>
+              <w:rPr>
+                <w:rFonts w:ascii="Times New Roman" w:hAnsi="Times New Roman" w:cs="Times New Roman"/>
+                <w:b/>
+                <w:bCs/>
+              </w:rPr>
+              <w:t>License Number</w:t>
+            </w:r>
+            <w:r>
+              <w:rPr>
+                <w:rFonts w:ascii="Times New Roman" w:hAnsi="Times New Roman" w:cs="Times New Roman"/>
+              </w:rPr>
+              <w:t xml:space="preserve">, and setting their </w:t>
+            </w:r>
+            <w:r>
+              <w:rPr>
+                <w:rFonts w:ascii="Times New Roman" w:hAnsi="Times New Roman" w:cs="Times New Roman"/>
+                <w:b/>
+                <w:bCs/>
+              </w:rPr>
+              <w:t>Hourly Rate</w:t>
+            </w:r>
+            <w:r>
+              <w:rPr>
+                <w:rFonts w:ascii="Times New Roman" w:hAnsi="Times New Roman" w:cs="Times New Roman"/>
+              </w:rPr>
+              <w:t xml:space="preserve"> and </w:t>
+            </w:r>
+            <w:r>
+              <w:rPr>
+                <w:rFonts w:ascii="Times New Roman" w:hAnsi="Times New Roman" w:cs="Times New Roman"/>
+                <w:b/>
+                <w:bCs/>
+              </w:rPr>
+              <w:t>Description</w:t>
+            </w:r>
+            <w:r>
+              <w:rPr>
+                <w:rFonts w:ascii="Times New Roman" w:hAnsi="Times New Roman" w:cs="Times New Roman"/>
+              </w:rPr>
+              <w:t>. The system validates these inputs to create a complete Mechanic Profile.</w:t>
+            </w:r>
+          </w:p>
+        </w:tc>
+      </w:tr>
+      <w:tr>
+        <w:trPr>
+          <w:trHeight w:val="3590"/>
+        </w:trPr>
+        <w:tc>
+          <w:tcPr>
+            <w:tcW w:w="5395" w:type="dxa"/>
+          </w:tcPr>
+          <w:p>
+            <w:pPr>
+              <w:rPr>
+                <w:rFonts w:ascii="Times New Roman" w:hAnsi="Times New Roman" w:cs="Times New Roman"/>
+              </w:rPr>
+            </w:pPr>
+          </w:p>
+          <w:p>
+            <w:pPr>
+              <w:rPr>
+                <w:rFonts w:ascii="Times New Roman" w:hAnsi="Times New Roman" w:cs="Times New Roman"/>
+              </w:rPr>
+            </w:pPr>
+          </w:p>
+          <w:p>
+            <w:pPr>
+              <w:rPr>
+                <w:rFonts w:ascii="Times New Roman" w:hAnsi="Times New Roman" w:cs="Times New Roman"/>
+              </w:rPr>
+            </w:pPr>
+          </w:p>
+          <w:p>
+            <w:pPr>
+              <w:rPr>
+                <w:rFonts w:ascii="Times New Roman" w:hAnsi="Times New Roman" w:cs="Times New Roman"/>
+              </w:rPr>
+            </w:pPr>
+          </w:p>
+          <w:p>
+            <w:pPr>
+              <w:rPr>
+                <w:rFonts w:ascii="Times New Roman" w:hAnsi="Times New Roman" w:cs="Times New Roman"/>
+              </w:rPr>
+            </w:pPr>
+          </w:p>
+          <w:p>
+            <w:pPr>
+              <w:rPr>
+                <w:rFonts w:ascii="Times New Roman" w:hAnsi="Times New Roman" w:cs="Times New Roman"/>
+              </w:rPr>
+            </w:pPr>
+          </w:p>
+          <w:p>
+            <w:pPr>
+              <w:rPr>
+                <w:rFonts w:ascii="Times New Roman" w:hAnsi="Times New Roman" w:cs="Times New Roman"/>
+              </w:rPr>
+            </w:pPr>
+            <w:r>
+              <w:rPr>
+                <w:rFonts w:ascii="Times New Roman" w:hAnsi="Times New Roman" w:cs="Times New Roman"/>
+              </w:rPr>
+              <w:t xml:space="preserve">Interaction 2: </w:t>
+            </w:r>
+            <w:r>
+              <w:rPr>
+                <w:rFonts w:ascii="Times New Roman" w:hAnsi="Times New Roman" w:cs="Times New Roman"/>
+              </w:rPr>
+              <w:t>Mechanic</w:t>
+            </w:r>
+            <w:r>
+              <w:rPr>
+                <w:rFonts w:ascii="Times New Roman" w:hAnsi="Times New Roman" w:cs="Times New Roman"/>
+              </w:rPr>
+              <w:t xml:space="preserve"> Shop Details</w:t>
+            </w:r>
+          </w:p>
+        </w:tc>
+        <w:tc>
+          <w:tcPr>
+            <w:tcW w:w="5395" w:type="dxa"/>
+          </w:tcPr>
+          <w:p>
+            <w:pPr>
+              <w:rPr>
+                <w:rFonts w:ascii="Times New Roman" w:hAnsi="Times New Roman" w:cs="Times New Roman"/>
+              </w:rPr>
+            </w:pPr>
+            <w:r>
+              <w:rPr>
+                <w:rFonts w:ascii="Times New Roman" w:hAnsi="Times New Roman" w:cs="Times New Roman"/>
+              </w:rPr>
+              <w:t xml:space="preserve">This interaction starts with the Mechanic accessing the </w:t>
+            </w:r>
+            <w:r>
+              <w:rPr>
+                <w:rFonts w:ascii="Times New Roman" w:hAnsi="Times New Roman" w:cs="Times New Roman"/>
+                <w:b/>
+                <w:bCs/>
+              </w:rPr>
+              <w:t>View Dashboard</w:t>
+            </w:r>
+            <w:r>
+              <w:rPr>
+                <w:rFonts w:ascii="Times New Roman" w:hAnsi="Times New Roman" w:cs="Times New Roman"/>
+              </w:rPr>
+              <w:t xml:space="preserve"> and navigating to the </w:t>
+            </w:r>
+            <w:r>
+              <w:rPr>
+                <w:rFonts w:ascii="Times New Roman" w:hAnsi="Times New Roman" w:cs="Times New Roman"/>
+                <w:b/>
+                <w:bCs/>
+              </w:rPr>
+              <w:t>View Shop</w:t>
+            </w:r>
+            <w:r>
+              <w:rPr>
+                <w:rFonts w:ascii="Times New Roman" w:hAnsi="Times New Roman" w:cs="Times New Roman"/>
+              </w:rPr>
+              <w:t xml:space="preserve"> section to check current performance metrics like </w:t>
+            </w:r>
+            <w:r>
+              <w:rPr>
+                <w:rFonts w:ascii="Times New Roman" w:hAnsi="Times New Roman" w:cs="Times New Roman"/>
+                <w:b/>
+                <w:bCs/>
+              </w:rPr>
+              <w:t>Shop Status</w:t>
+            </w:r>
+            <w:r>
+              <w:rPr>
+                <w:rFonts w:ascii="Times New Roman" w:hAnsi="Times New Roman" w:cs="Times New Roman"/>
+              </w:rPr>
+              <w:t xml:space="preserve">, </w:t>
+            </w:r>
+            <w:r>
+              <w:rPr>
+                <w:rFonts w:ascii="Times New Roman" w:hAnsi="Times New Roman" w:cs="Times New Roman"/>
+                <w:b/>
+                <w:bCs/>
+              </w:rPr>
+              <w:t>Rating &amp; Reviews</w:t>
+            </w:r>
+            <w:r>
+              <w:rPr>
+                <w:rFonts w:ascii="Times New Roman" w:hAnsi="Times New Roman" w:cs="Times New Roman"/>
+              </w:rPr>
+              <w:t xml:space="preserve">, and </w:t>
+            </w:r>
+            <w:r>
+              <w:rPr>
+                <w:rFonts w:ascii="Times New Roman" w:hAnsi="Times New Roman" w:cs="Times New Roman"/>
+                <w:b/>
+                <w:bCs/>
+              </w:rPr>
+              <w:t>Services &amp; Pricing</w:t>
+            </w:r>
+            <w:r>
+              <w:rPr>
+                <w:rFonts w:ascii="Times New Roman" w:hAnsi="Times New Roman" w:cs="Times New Roman"/>
+              </w:rPr>
+              <w:t xml:space="preserve">. If updates are needed, the Mechanic proceeds to the </w:t>
+            </w:r>
+            <w:r>
+              <w:rPr>
+                <w:rFonts w:ascii="Times New Roman" w:hAnsi="Times New Roman" w:cs="Times New Roman"/>
+                <w:b/>
+                <w:bCs/>
+              </w:rPr>
+              <w:t>Edit Shop</w:t>
+            </w:r>
+            <w:r>
+              <w:rPr>
+                <w:rFonts w:ascii="Times New Roman" w:hAnsi="Times New Roman" w:cs="Times New Roman"/>
+              </w:rPr>
+              <w:t xml:space="preserve"> function. From here, the system provides an extended menu of options, allowing the Mechanic to modify specific operational details such as the </w:t>
+            </w:r>
+            <w:r>
+              <w:rPr>
+                <w:rFonts w:ascii="Times New Roman" w:hAnsi="Times New Roman" w:cs="Times New Roman"/>
+                <w:b/>
+                <w:bCs/>
+              </w:rPr>
+              <w:t>Business Address</w:t>
+            </w:r>
+            <w:r>
+              <w:rPr>
+                <w:rFonts w:ascii="Times New Roman" w:hAnsi="Times New Roman" w:cs="Times New Roman"/>
+              </w:rPr>
+              <w:t xml:space="preserve">, </w:t>
+            </w:r>
+            <w:r>
+              <w:rPr>
+                <w:rFonts w:ascii="Times New Roman" w:hAnsi="Times New Roman" w:cs="Times New Roman"/>
+                <w:b/>
+                <w:bCs/>
+              </w:rPr>
+              <w:t>Hourly Rate</w:t>
+            </w:r>
+            <w:r>
+              <w:rPr>
+                <w:rFonts w:ascii="Times New Roman" w:hAnsi="Times New Roman" w:cs="Times New Roman"/>
+              </w:rPr>
+              <w:t xml:space="preserve">, </w:t>
+            </w:r>
+            <w:r>
+              <w:rPr>
+                <w:rFonts w:ascii="Times New Roman" w:hAnsi="Times New Roman" w:cs="Times New Roman"/>
+                <w:b/>
+                <w:bCs/>
+              </w:rPr>
+              <w:t>Telephone</w:t>
+            </w:r>
+            <w:r>
+              <w:rPr>
+                <w:rFonts w:ascii="Times New Roman" w:hAnsi="Times New Roman" w:cs="Times New Roman"/>
+              </w:rPr>
+              <w:t xml:space="preserve">, </w:t>
+            </w:r>
+            <w:r>
+              <w:rPr>
+                <w:rFonts w:ascii="Times New Roman" w:hAnsi="Times New Roman" w:cs="Times New Roman"/>
+                <w:b/>
+                <w:bCs/>
+              </w:rPr>
+              <w:t>Specializations</w:t>
+            </w:r>
+            <w:r>
+              <w:rPr>
+                <w:rFonts w:ascii="Times New Roman" w:hAnsi="Times New Roman" w:cs="Times New Roman"/>
+              </w:rPr>
+              <w:t xml:space="preserve">, and </w:t>
+            </w:r>
+            <w:r>
+              <w:rPr>
+                <w:rFonts w:ascii="Times New Roman" w:hAnsi="Times New Roman" w:cs="Times New Roman"/>
+                <w:b/>
+                <w:bCs/>
+              </w:rPr>
+              <w:t>Availability</w:t>
+            </w:r>
+            <w:r>
+              <w:rPr>
+                <w:rFonts w:ascii="Times New Roman" w:hAnsi="Times New Roman" w:cs="Times New Roman"/>
+              </w:rPr>
+              <w:t>. The interaction concludes when the system saves these modified business attributes to the database.</w:t>
+            </w:r>
+          </w:p>
+        </w:tc>
+      </w:tr>
+      <w:tr>
+        <w:trPr>
+          <w:trHeight w:val="3590"/>
+        </w:trPr>
+        <w:tc>
+          <w:tcPr>
+            <w:tcW w:w="5395" w:type="dxa"/>
+          </w:tcPr>
+          <w:p>
+            <w:pPr>
+              <w:rPr>
+                <w:rFonts w:ascii="Times New Roman" w:hAnsi="Times New Roman" w:cs="Times New Roman"/>
+              </w:rPr>
+            </w:pPr>
+          </w:p>
+          <w:p>
+            <w:pPr>
+              <w:rPr>
+                <w:rFonts w:ascii="Times New Roman" w:hAnsi="Times New Roman" w:cs="Times New Roman"/>
+              </w:rPr>
+            </w:pPr>
+          </w:p>
+          <w:p>
+            <w:pPr>
+              <w:rPr>
+                <w:rFonts w:ascii="Times New Roman" w:hAnsi="Times New Roman" w:cs="Times New Roman"/>
+              </w:rPr>
+            </w:pPr>
+          </w:p>
+          <w:p>
+            <w:pPr>
+              <w:rPr>
+                <w:rFonts w:ascii="Times New Roman" w:hAnsi="Times New Roman" w:cs="Times New Roman"/>
+              </w:rPr>
+            </w:pPr>
+          </w:p>
+          <w:p>
+            <w:pPr>
+              <w:rPr>
+                <w:rFonts w:ascii="Times New Roman" w:hAnsi="Times New Roman" w:cs="Times New Roman"/>
+              </w:rPr>
+            </w:pPr>
+          </w:p>
+          <w:p>
+            <w:pPr>
+              <w:rPr>
+                <w:rFonts w:ascii="Times New Roman" w:hAnsi="Times New Roman" w:cs="Times New Roman"/>
+              </w:rPr>
+            </w:pPr>
+          </w:p>
+          <w:p>
+            <w:pPr>
+              <w:rPr>
+                <w:rFonts w:ascii="Times New Roman" w:hAnsi="Times New Roman" w:cs="Times New Roman"/>
+              </w:rPr>
+            </w:pPr>
+            <w:r>
+              <w:rPr>
+                <w:rFonts w:ascii="Times New Roman" w:hAnsi="Times New Roman" w:cs="Times New Roman"/>
+              </w:rPr>
+              <w:t xml:space="preserve">Interaction 3: </w:t>
+            </w:r>
+            <w:r>
+              <w:rPr>
+                <w:rFonts w:ascii="Times New Roman" w:hAnsi="Times New Roman" w:cs="Times New Roman"/>
+              </w:rPr>
+              <w:t xml:space="preserve">Mechanic </w:t>
+            </w:r>
+            <w:r>
+              <w:rPr>
+                <w:rFonts w:ascii="Times New Roman" w:hAnsi="Times New Roman" w:cs="Times New Roman"/>
+              </w:rPr>
+              <w:t>Appointment Review</w:t>
+            </w:r>
+          </w:p>
+        </w:tc>
+        <w:tc>
+          <w:tcPr>
+            <w:tcW w:w="5395" w:type="dxa"/>
+          </w:tcPr>
+          <w:p>
+            <w:pPr>
+              <w:rPr>
+                <w:rFonts w:ascii="Times New Roman" w:hAnsi="Times New Roman" w:cs="Times New Roman"/>
+              </w:rPr>
+            </w:pPr>
+            <w:r>
+              <w:rPr>
+                <w:rFonts w:ascii="Times New Roman" w:hAnsi="Times New Roman" w:cs="Times New Roman"/>
+              </w:rPr>
+              <w:t xml:space="preserve">To manage their schedule, the Mechanic navigates from the </w:t>
+            </w:r>
+            <w:r>
+              <w:rPr>
+                <w:rFonts w:ascii="Times New Roman" w:hAnsi="Times New Roman" w:cs="Times New Roman"/>
+                <w:b/>
+                <w:bCs/>
+              </w:rPr>
+              <w:t>View Dashboard</w:t>
+            </w:r>
+            <w:r>
+              <w:rPr>
+                <w:rFonts w:ascii="Times New Roman" w:hAnsi="Times New Roman" w:cs="Times New Roman"/>
+              </w:rPr>
+              <w:t xml:space="preserve"> to the </w:t>
+            </w:r>
+            <w:r>
+              <w:rPr>
+                <w:rFonts w:ascii="Times New Roman" w:hAnsi="Times New Roman" w:cs="Times New Roman"/>
+                <w:b/>
+                <w:bCs/>
+              </w:rPr>
+              <w:t>View Appointments</w:t>
+            </w:r>
+            <w:r>
+              <w:rPr>
+                <w:rFonts w:ascii="Times New Roman" w:hAnsi="Times New Roman" w:cs="Times New Roman"/>
+              </w:rPr>
+              <w:t xml:space="preserve"> module. The system initially retrieves the appointment data, which the Mechanic can then filter based on the current status of the jobs. The diagram illustrates that the Mechanic can specifically choose to </w:t>
+            </w:r>
+            <w:r>
+              <w:rPr>
+                <w:rFonts w:ascii="Times New Roman" w:hAnsi="Times New Roman" w:cs="Times New Roman"/>
+                <w:b/>
+                <w:bCs/>
+              </w:rPr>
+              <w:t>View Pending Appointments</w:t>
+            </w:r>
+            <w:r>
+              <w:rPr>
+                <w:rFonts w:ascii="Times New Roman" w:hAnsi="Times New Roman" w:cs="Times New Roman"/>
+              </w:rPr>
+              <w:t xml:space="preserve"> to approve new requests, </w:t>
+            </w:r>
+            <w:r>
+              <w:rPr>
+                <w:rFonts w:ascii="Times New Roman" w:hAnsi="Times New Roman" w:cs="Times New Roman"/>
+                <w:b/>
+                <w:bCs/>
+              </w:rPr>
+              <w:t>View Accepted Appointments</w:t>
+            </w:r>
+            <w:r>
+              <w:rPr>
+                <w:rFonts w:ascii="Times New Roman" w:hAnsi="Times New Roman" w:cs="Times New Roman"/>
+              </w:rPr>
+              <w:t xml:space="preserve"> to see upcoming </w:t>
+            </w:r>
+            <w:r>
+              <w:rPr>
+                <w:rFonts w:ascii="Times New Roman" w:hAnsi="Times New Roman" w:cs="Times New Roman"/>
+              </w:rPr>
+              <w:t>work or</w:t>
+            </w:r>
+            <w:r>
+              <w:rPr>
+                <w:rFonts w:ascii="Times New Roman" w:hAnsi="Times New Roman" w:cs="Times New Roman"/>
+              </w:rPr>
+              <w:t xml:space="preserve"> </w:t>
+            </w:r>
+            <w:r>
+              <w:rPr>
+                <w:rFonts w:ascii="Times New Roman" w:hAnsi="Times New Roman" w:cs="Times New Roman"/>
+                <w:b/>
+                <w:bCs/>
+              </w:rPr>
+              <w:t>View Confirmed Appointments</w:t>
+            </w:r>
+            <w:r>
+              <w:rPr>
+                <w:rFonts w:ascii="Times New Roman" w:hAnsi="Times New Roman" w:cs="Times New Roman"/>
+              </w:rPr>
+              <w:t xml:space="preserve"> to track finalizing jobs. This interaction allows the Mechanic to segregate their workflow based on the job's lifecycle stage.</w:t>
+            </w:r>
+          </w:p>
+        </w:tc>
+      </w:tr>
+      <w:tr>
+        <w:tc>
+          <w:tcPr>
+            <w:tcW w:w="5395" w:type="dxa"/>
+          </w:tcPr>
+          <w:p>
+            <w:pPr>
+              <w:rPr>
+                <w:rFonts w:ascii="Times New Roman" w:hAnsi="Times New Roman" w:cs="Times New Roman"/>
+                <w:b/>
+                <w:bCs/>
+              </w:rPr>
+            </w:pPr>
+          </w:p>
+          <w:p>
+            <w:pPr>
+              <w:rPr>
+                <w:rFonts w:ascii="Times New Roman" w:hAnsi="Times New Roman" w:cs="Times New Roman"/>
+                <w:b/>
+                <w:bCs/>
+              </w:rPr>
+            </w:pPr>
+          </w:p>
+          <w:p>
+            <w:pPr>
+              <w:rPr>
+                <w:rFonts w:ascii="Times New Roman" w:hAnsi="Times New Roman" w:cs="Times New Roman"/>
+                <w:b/>
+                <w:bCs/>
+              </w:rPr>
+            </w:pPr>
+          </w:p>
+          <w:p>
+            <w:pPr>
+              <w:rPr>
+                <w:rFonts w:ascii="Times New Roman" w:hAnsi="Times New Roman" w:cs="Times New Roman"/>
+              </w:rPr>
+            </w:pPr>
+          </w:p>
+          <w:p>
+            <w:pPr>
+              <w:rPr>
+                <w:rFonts w:ascii="Times New Roman" w:hAnsi="Times New Roman" w:cs="Times New Roman"/>
+              </w:rPr>
+            </w:pPr>
+            <w:r>
+              <w:rPr>
+                <w:rFonts w:ascii="Times New Roman" w:hAnsi="Times New Roman" w:cs="Times New Roman"/>
+              </w:rPr>
+              <w:t xml:space="preserve">Interaction 4: </w:t>
+            </w:r>
+            <w:r>
+              <w:rPr>
+                <w:rFonts w:ascii="Times New Roman" w:hAnsi="Times New Roman" w:cs="Times New Roman"/>
+              </w:rPr>
+              <w:t xml:space="preserve">Mechanic </w:t>
+            </w:r>
+            <w:r>
+              <w:rPr>
+                <w:rFonts w:ascii="Times New Roman" w:hAnsi="Times New Roman" w:cs="Times New Roman"/>
+              </w:rPr>
+              <w:t>Profile Update</w:t>
+            </w:r>
+          </w:p>
+        </w:tc>
+        <w:tc>
+          <w:tcPr>
+            <w:tcW w:w="5395" w:type="dxa"/>
+          </w:tcPr>
+          <w:p>
+            <w:pPr>
+              <w:rPr>
+                <w:rFonts w:ascii="Times New Roman" w:hAnsi="Times New Roman" w:cs="Times New Roman"/>
+              </w:rPr>
+            </w:pPr>
+            <w:r>
+              <w:rPr>
+                <w:rFonts w:ascii="Times New Roman" w:hAnsi="Times New Roman" w:cs="Times New Roman"/>
+              </w:rPr>
+              <w:t xml:space="preserve">This interaction focuses on the Mechanic's personal account information rather than the shop's business data. Starting from the </w:t>
+            </w:r>
+            <w:r>
+              <w:rPr>
+                <w:rFonts w:ascii="Times New Roman" w:hAnsi="Times New Roman" w:cs="Times New Roman"/>
+                <w:b/>
+                <w:bCs/>
+              </w:rPr>
+              <w:t>View Dashboard</w:t>
+            </w:r>
+            <w:r>
+              <w:rPr>
+                <w:rFonts w:ascii="Times New Roman" w:hAnsi="Times New Roman" w:cs="Times New Roman"/>
+              </w:rPr>
+              <w:t xml:space="preserve">, the Mechanic selects </w:t>
+            </w:r>
+            <w:r>
+              <w:rPr>
+                <w:rFonts w:ascii="Times New Roman" w:hAnsi="Times New Roman" w:cs="Times New Roman"/>
+                <w:b/>
+                <w:bCs/>
+              </w:rPr>
+              <w:t>View Profile</w:t>
+            </w:r>
+            <w:r>
+              <w:rPr>
+                <w:rFonts w:ascii="Times New Roman" w:hAnsi="Times New Roman" w:cs="Times New Roman"/>
+              </w:rPr>
+              <w:t xml:space="preserve"> to see their registered personal details. If contact information has changed, the interaction extends to specific editing functions. The Mechanic can choose to </w:t>
+            </w:r>
+            <w:r>
+              <w:rPr>
+                <w:rFonts w:ascii="Times New Roman" w:hAnsi="Times New Roman" w:cs="Times New Roman"/>
+                <w:b/>
+                <w:bCs/>
+              </w:rPr>
+              <w:t>Edit First Name</w:t>
+            </w:r>
+            <w:r>
+              <w:rPr>
+                <w:rFonts w:ascii="Times New Roman" w:hAnsi="Times New Roman" w:cs="Times New Roman"/>
+              </w:rPr>
+              <w:t xml:space="preserve">, </w:t>
+            </w:r>
+            <w:r>
+              <w:rPr>
+                <w:rFonts w:ascii="Times New Roman" w:hAnsi="Times New Roman" w:cs="Times New Roman"/>
+                <w:b/>
+                <w:bCs/>
+              </w:rPr>
+              <w:t>Edit Last Name</w:t>
+            </w:r>
+            <w:r>
+              <w:rPr>
+                <w:rFonts w:ascii="Times New Roman" w:hAnsi="Times New Roman" w:cs="Times New Roman"/>
+              </w:rPr>
+              <w:t xml:space="preserve">, </w:t>
+            </w:r>
+            <w:r>
+              <w:rPr>
+                <w:rFonts w:ascii="Times New Roman" w:hAnsi="Times New Roman" w:cs="Times New Roman"/>
+                <w:b/>
+                <w:bCs/>
+              </w:rPr>
+              <w:t>Edit Email</w:t>
+            </w:r>
+            <w:r>
+              <w:rPr>
+                <w:rFonts w:ascii="Times New Roman" w:hAnsi="Times New Roman" w:cs="Times New Roman"/>
+              </w:rPr>
+              <w:t xml:space="preserve">, or </w:t>
+            </w:r>
+            <w:r>
+              <w:rPr>
+                <w:rFonts w:ascii="Times New Roman" w:hAnsi="Times New Roman" w:cs="Times New Roman"/>
+                <w:b/>
+                <w:bCs/>
+              </w:rPr>
+              <w:t>Edit Telephone</w:t>
+            </w:r>
+            <w:r>
+              <w:rPr>
+                <w:rFonts w:ascii="Times New Roman" w:hAnsi="Times New Roman" w:cs="Times New Roman"/>
+              </w:rPr>
+              <w:t>. The system captures these inputs and updates the Mechanic's personal record, ensuring that communication channels remain accurate.</w:t>
+            </w:r>
+          </w:p>
+        </w:tc>
+      </w:tr>
+    </w:tbl>
     <w:p>
       <w:pPr>
         <w:pStyle w:val="ListParagraph"/>
@@ -4560,6 +5359,7 @@
           <w:sz w:val="28"/>
           <w:szCs w:val="28"/>
         </w:rPr>
+        <w:lastRenderedPageBreak/>
         <w:t>Application architecture and describing these modules</w:t>
       </w:r>
     </w:p>
@@ -4587,7 +5387,6 @@
           <w:rFonts w:ascii="Times New Roman" w:hAnsi="Times New Roman" w:cs="Times New Roman"/>
           <w:noProof/>
         </w:rPr>
-        <w:lastRenderedPageBreak/>
         <w:drawing>
           <wp:inline distT="0" distB="0" distL="0" distR="0" wp14:anchorId="72AE1302" wp14:editId="7D5E5847">
             <wp:extent cx="6858000" cy="2926080"/>
@@ -4604,7 +5403,7 @@
                     <pic:cNvPicPr/>
                   </pic:nvPicPr>
                   <pic:blipFill>
-                    <a:blip r:embed="rId18"/>
+                    <a:blip r:embed="rId20"/>
                     <a:stretch>
                       <a:fillRect/>
                     </a:stretch>
@@ -4842,21 +5641,7 @@
         <w:rPr>
           <w:rFonts w:ascii="Times New Roman" w:hAnsi="Times New Roman" w:cs="Times New Roman"/>
         </w:rPr>
-        <w:t xml:space="preserve"> As indicated by the Flutter logo, the app is built using a single codebase that compiles natively for both Android and iOS. This ensures </w:t>
-      </w:r>
-      <w:proofErr w:type="gramStart"/>
-      <w:r>
-        <w:rPr>
-          <w:rFonts w:ascii="Times New Roman" w:hAnsi="Times New Roman" w:cs="Times New Roman"/>
-        </w:rPr>
-        <w:t>a consistent</w:t>
-      </w:r>
-      <w:proofErr w:type="gramEnd"/>
-      <w:r>
-        <w:rPr>
-          <w:rFonts w:ascii="Times New Roman" w:hAnsi="Times New Roman" w:cs="Times New Roman"/>
-        </w:rPr>
-        <w:t xml:space="preserve"> UI and logic across different devices.</w:t>
+        <w:t xml:space="preserve"> As indicated by the Flutter logo, the app is built using a single codebase that compiles natively for both Android and iOS. This ensures a consistent UI and logic across different devices.</w:t>
       </w:r>
     </w:p>
     <w:p>
@@ -4943,6 +5728,7 @@
           <w:b/>
           <w:bCs/>
         </w:rPr>
+        <w:lastRenderedPageBreak/>
         <w:t>3. Communication Layer (The "Bridge")</w:t>
       </w:r>
     </w:p>
@@ -4968,38 +5754,22 @@
         <w:rPr>
           <w:rFonts w:ascii="Times New Roman" w:hAnsi="Times New Roman" w:cs="Times New Roman"/>
         </w:rPr>
-        <w:t xml:space="preserve"> The arrows connecting the mobile devices to </w:t>
-      </w:r>
-      <w:proofErr w:type="spellStart"/>
+        <w:t xml:space="preserve"> The arrows connecting the mobile devices to Supabase, labeled </w:t>
+      </w:r>
+      <w:r>
+        <w:rPr>
+          <w:rFonts w:ascii="Times New Roman" w:hAnsi="Times New Roman" w:cs="Times New Roman"/>
+          <w:b/>
+          <w:bCs/>
+        </w:rPr>
+        <w:t>"</w:t>
+      </w:r>
       <w:r>
         <w:rPr>
           <w:rFonts w:ascii="Times New Roman" w:hAnsi="Times New Roman" w:cs="Times New Roman"/>
         </w:rPr>
         <w:t>Supabase</w:t>
       </w:r>
-      <w:proofErr w:type="spellEnd"/>
-      <w:r>
-        <w:rPr>
-          <w:rFonts w:ascii="Times New Roman" w:hAnsi="Times New Roman" w:cs="Times New Roman"/>
-        </w:rPr>
-        <w:t xml:space="preserve">, labeled </w:t>
-      </w:r>
-      <w:r>
-        <w:rPr>
-          <w:rFonts w:ascii="Times New Roman" w:hAnsi="Times New Roman" w:cs="Times New Roman"/>
-          <w:b/>
-          <w:bCs/>
-        </w:rPr>
-        <w:t>"</w:t>
-      </w:r>
-      <w:proofErr w:type="spellStart"/>
-      <w:r>
-        <w:rPr>
-          <w:rFonts w:ascii="Times New Roman" w:hAnsi="Times New Roman" w:cs="Times New Roman"/>
-        </w:rPr>
-        <w:t>Supabase</w:t>
-      </w:r>
-      <w:proofErr w:type="spellEnd"/>
       <w:r>
         <w:rPr>
           <w:rFonts w:ascii="Times New Roman" w:hAnsi="Times New Roman" w:cs="Times New Roman"/>
@@ -5064,44 +5834,19 @@
           <w:rFonts w:ascii="Times New Roman" w:hAnsi="Times New Roman" w:cs="Times New Roman"/>
         </w:rPr>
       </w:pPr>
-      <w:proofErr w:type="spellStart"/>
-      <w:r>
-        <w:rPr>
-          <w:rFonts w:ascii="Times New Roman" w:hAnsi="Times New Roman" w:cs="Times New Roman"/>
-          <w:b/>
-          <w:bCs/>
-        </w:rPr>
-        <w:lastRenderedPageBreak/>
-        <w:t>Supabase</w:t>
-      </w:r>
-      <w:proofErr w:type="spellEnd"/>
-      <w:r>
-        <w:rPr>
-          <w:rFonts w:ascii="Times New Roman" w:hAnsi="Times New Roman" w:cs="Times New Roman"/>
-          <w:b/>
-          <w:bCs/>
-        </w:rPr>
-        <w:t xml:space="preserve"> Client:</w:t>
-      </w:r>
-      <w:r>
-        <w:rPr>
-          <w:rFonts w:ascii="Times New Roman" w:hAnsi="Times New Roman" w:cs="Times New Roman"/>
-        </w:rPr>
-        <w:t xml:space="preserve"> The Flutter app uses the </w:t>
-      </w:r>
-      <w:proofErr w:type="spellStart"/>
-      <w:r>
-        <w:rPr>
-          <w:rFonts w:ascii="Times New Roman" w:hAnsi="Times New Roman" w:cs="Times New Roman"/>
-        </w:rPr>
-        <w:t>supabase_flutter</w:t>
-      </w:r>
-      <w:proofErr w:type="spellEnd"/>
-      <w:r>
-        <w:rPr>
-          <w:rFonts w:ascii="Times New Roman" w:hAnsi="Times New Roman" w:cs="Times New Roman"/>
-        </w:rPr>
-        <w:t xml:space="preserve"> SDK to communicate with the backend.</w:t>
+      <w:r>
+        <w:rPr>
+          <w:rFonts w:ascii="Times New Roman" w:hAnsi="Times New Roman" w:cs="Times New Roman"/>
+          <w:b/>
+          <w:bCs/>
+        </w:rPr>
+        <w:t>Supabase Client:</w:t>
+      </w:r>
+      <w:r>
+        <w:rPr>
+          <w:rFonts w:ascii="Times New Roman" w:hAnsi="Times New Roman" w:cs="Times New Roman"/>
+        </w:rPr>
+        <w:t xml:space="preserve"> The Flutter app uses the supabase_flutter SDK to communicate with the backend.</w:t>
       </w:r>
     </w:p>
     <w:p>
@@ -5126,21 +5871,7 @@
         <w:rPr>
           <w:rFonts w:ascii="Times New Roman" w:hAnsi="Times New Roman" w:cs="Times New Roman"/>
         </w:rPr>
-        <w:t xml:space="preserve"> It utilizes secure REST API calls for standard actions (like "Create Appointment") and </w:t>
-      </w:r>
-      <w:proofErr w:type="spellStart"/>
-      <w:r>
-        <w:rPr>
-          <w:rFonts w:ascii="Times New Roman" w:hAnsi="Times New Roman" w:cs="Times New Roman"/>
-        </w:rPr>
-        <w:t>WebSockets</w:t>
-      </w:r>
-      <w:proofErr w:type="spellEnd"/>
-      <w:r>
-        <w:rPr>
-          <w:rFonts w:ascii="Times New Roman" w:hAnsi="Times New Roman" w:cs="Times New Roman"/>
-        </w:rPr>
-        <w:t xml:space="preserve"> for Realtime features (like receiving an instant notification when a mechanic accepts a job).</w:t>
+        <w:t xml:space="preserve"> It utilizes secure REST API calls for standard actions (like "Create Appointment") and WebSockets for Realtime features (like receiving an instant notification when a mechanic accepts a job).</w:t>
       </w:r>
     </w:p>
     <w:p>
@@ -5182,21 +5913,7 @@
         <w:rPr>
           <w:rFonts w:ascii="Times New Roman" w:hAnsi="Times New Roman" w:cs="Times New Roman"/>
         </w:rPr>
-        <w:t xml:space="preserve"> The green </w:t>
-      </w:r>
-      <w:proofErr w:type="spellStart"/>
-      <w:r>
-        <w:rPr>
-          <w:rFonts w:ascii="Times New Roman" w:hAnsi="Times New Roman" w:cs="Times New Roman"/>
-        </w:rPr>
-        <w:t>Supabase</w:t>
-      </w:r>
-      <w:proofErr w:type="spellEnd"/>
-      <w:r>
-        <w:rPr>
-          <w:rFonts w:ascii="Times New Roman" w:hAnsi="Times New Roman" w:cs="Times New Roman"/>
-        </w:rPr>
-        <w:t xml:space="preserve"> logo on the far right.</w:t>
+        <w:t xml:space="preserve"> The green Supabase logo on the far right.</w:t>
       </w:r>
     </w:p>
     <w:p>
@@ -5221,35 +5938,7 @@
         <w:rPr>
           <w:rFonts w:ascii="Times New Roman" w:hAnsi="Times New Roman" w:cs="Times New Roman"/>
         </w:rPr>
-        <w:t xml:space="preserve"> </w:t>
-      </w:r>
-      <w:proofErr w:type="spellStart"/>
-      <w:r>
-        <w:rPr>
-          <w:rFonts w:ascii="Times New Roman" w:hAnsi="Times New Roman" w:cs="Times New Roman"/>
-        </w:rPr>
-        <w:t>Supabase</w:t>
-      </w:r>
-      <w:proofErr w:type="spellEnd"/>
-      <w:r>
-        <w:rPr>
-          <w:rFonts w:ascii="Times New Roman" w:hAnsi="Times New Roman" w:cs="Times New Roman"/>
-        </w:rPr>
-        <w:t xml:space="preserve"> acts as the centralized backend infrastructure, replacing the need for a traditional custom server. It </w:t>
-      </w:r>
-      <w:proofErr w:type="gramStart"/>
-      <w:r>
-        <w:rPr>
-          <w:rFonts w:ascii="Times New Roman" w:hAnsi="Times New Roman" w:cs="Times New Roman"/>
-        </w:rPr>
-        <w:t>manages</w:t>
-      </w:r>
-      <w:proofErr w:type="gramEnd"/>
-      <w:r>
-        <w:rPr>
-          <w:rFonts w:ascii="Times New Roman" w:hAnsi="Times New Roman" w:cs="Times New Roman"/>
-        </w:rPr>
-        <w:t xml:space="preserve"> four key components:</w:t>
+        <w:t xml:space="preserve"> Supabase acts as the centralized backend infrastructure, replacing the need for a traditional custom server. It manages four key components:</w:t>
       </w:r>
     </w:p>
     <w:p>
@@ -5349,223 +6038,7 @@
         <w:rPr>
           <w:rFonts w:ascii="Times New Roman" w:hAnsi="Times New Roman" w:cs="Times New Roman"/>
         </w:rPr>
-        <w:t xml:space="preserve"> Listens </w:t>
-      </w:r>
-      <w:proofErr w:type="gramStart"/>
-      <w:r>
-        <w:rPr>
-          <w:rFonts w:ascii="Times New Roman" w:hAnsi="Times New Roman" w:cs="Times New Roman"/>
-        </w:rPr>
-        <w:t>for</w:t>
-      </w:r>
-      <w:proofErr w:type="gramEnd"/>
-      <w:r>
-        <w:rPr>
-          <w:rFonts w:ascii="Times New Roman" w:hAnsi="Times New Roman" w:cs="Times New Roman"/>
-        </w:rPr>
-        <w:t xml:space="preserve"> changes in the database (e.g., a status change from "Pending" to "Confirmed") and instantly pushes updates to the Flutter app.</w:t>
-      </w:r>
-    </w:p>
-    <w:p>
-      <w:pPr>
-        <w:rPr>
-          <w:rFonts w:ascii="Times New Roman" w:hAnsi="Times New Roman" w:cs="Times New Roman"/>
-        </w:rPr>
-      </w:pPr>
-      <w:r>
-        <w:rPr>
-          <w:rFonts w:ascii="Times New Roman" w:hAnsi="Times New Roman" w:cs="Times New Roman"/>
-        </w:rPr>
-        <w:pict w14:anchorId="1CE80EAC">
-          <v:rect id="_x0000_i1025" style="width:0;height:1.5pt" o:hralign="center" o:hrstd="t" o:hr="t" fillcolor="#a0a0a0" stroked="f"/>
-        </w:pict>
-      </w:r>
-    </w:p>
-    <w:p>
-      <w:pPr>
-        <w:rPr>
-          <w:rFonts w:ascii="Times New Roman" w:hAnsi="Times New Roman" w:cs="Times New Roman"/>
-          <w:b/>
-          <w:bCs/>
-        </w:rPr>
-      </w:pPr>
-      <w:r>
-        <w:rPr>
-          <w:rFonts w:ascii="Times New Roman" w:hAnsi="Times New Roman" w:cs="Times New Roman"/>
-          <w:b/>
-          <w:bCs/>
-        </w:rPr>
-        <w:t>Data Flow Summary</w:t>
-      </w:r>
-    </w:p>
-    <w:p>
-      <w:pPr>
-        <w:numPr>
-          <w:ilvl w:val="0"/>
-          <w:numId w:val="5"/>
-        </w:numPr>
-        <w:rPr>
-          <w:rFonts w:ascii="Times New Roman" w:hAnsi="Times New Roman" w:cs="Times New Roman"/>
-        </w:rPr>
-      </w:pPr>
-      <w:r>
-        <w:rPr>
-          <w:rFonts w:ascii="Times New Roman" w:hAnsi="Times New Roman" w:cs="Times New Roman"/>
-          <w:b/>
-          <w:bCs/>
-        </w:rPr>
-        <w:t>Input:</w:t>
-      </w:r>
-      <w:r>
-        <w:rPr>
-          <w:rFonts w:ascii="Times New Roman" w:hAnsi="Times New Roman" w:cs="Times New Roman"/>
-        </w:rPr>
-        <w:t xml:space="preserve"> A User interacts with the Flutter</w:t>
-      </w:r>
-      <w:r>
-        <w:rPr>
-          <w:rFonts w:ascii="Times New Roman" w:hAnsi="Times New Roman" w:cs="Times New Roman"/>
-          <w:b/>
-          <w:bCs/>
-        </w:rPr>
-        <w:t xml:space="preserve"> </w:t>
-      </w:r>
-      <w:r>
-        <w:rPr>
-          <w:rFonts w:ascii="Times New Roman" w:hAnsi="Times New Roman" w:cs="Times New Roman"/>
-        </w:rPr>
-        <w:t>App (e.g., taps "Book Now").</w:t>
-      </w:r>
-    </w:p>
-    <w:p>
-      <w:pPr>
-        <w:numPr>
-          <w:ilvl w:val="0"/>
-          <w:numId w:val="5"/>
-        </w:numPr>
-        <w:rPr>
-          <w:rFonts w:ascii="Times New Roman" w:hAnsi="Times New Roman" w:cs="Times New Roman"/>
-        </w:rPr>
-      </w:pPr>
-      <w:r>
-        <w:rPr>
-          <w:rFonts w:ascii="Times New Roman" w:hAnsi="Times New Roman" w:cs="Times New Roman"/>
-          <w:b/>
-          <w:bCs/>
-        </w:rPr>
-        <w:t>Request:</w:t>
-      </w:r>
-      <w:r>
-        <w:rPr>
-          <w:rFonts w:ascii="Times New Roman" w:hAnsi="Times New Roman" w:cs="Times New Roman"/>
-        </w:rPr>
-        <w:t xml:space="preserve"> The app sends a request via </w:t>
-      </w:r>
-      <w:proofErr w:type="spellStart"/>
-      <w:r>
-        <w:rPr>
-          <w:rFonts w:ascii="Times New Roman" w:hAnsi="Times New Roman" w:cs="Times New Roman"/>
-        </w:rPr>
-        <w:t>Supabase</w:t>
-      </w:r>
-      <w:proofErr w:type="spellEnd"/>
-      <w:r>
-        <w:rPr>
-          <w:rFonts w:ascii="Times New Roman" w:hAnsi="Times New Roman" w:cs="Times New Roman"/>
-          <w:b/>
-          <w:bCs/>
-        </w:rPr>
-        <w:t xml:space="preserve"> </w:t>
-      </w:r>
-      <w:r>
-        <w:rPr>
-          <w:rFonts w:ascii="Times New Roman" w:hAnsi="Times New Roman" w:cs="Times New Roman"/>
-        </w:rPr>
-        <w:t>APIs.</w:t>
-      </w:r>
-    </w:p>
-    <w:p>
-      <w:pPr>
-        <w:numPr>
-          <w:ilvl w:val="0"/>
-          <w:numId w:val="5"/>
-        </w:numPr>
-        <w:rPr>
-          <w:rFonts w:ascii="Times New Roman" w:hAnsi="Times New Roman" w:cs="Times New Roman"/>
-        </w:rPr>
-      </w:pPr>
-      <w:r>
-        <w:rPr>
-          <w:rFonts w:ascii="Times New Roman" w:hAnsi="Times New Roman" w:cs="Times New Roman"/>
-          <w:b/>
-          <w:bCs/>
-        </w:rPr>
-        <w:t>Processing:</w:t>
-      </w:r>
-      <w:r>
-        <w:rPr>
-          <w:rFonts w:ascii="Times New Roman" w:hAnsi="Times New Roman" w:cs="Times New Roman"/>
-        </w:rPr>
-        <w:t xml:space="preserve"> </w:t>
-      </w:r>
-      <w:proofErr w:type="spellStart"/>
-      <w:r>
-        <w:rPr>
-          <w:rFonts w:ascii="Times New Roman" w:hAnsi="Times New Roman" w:cs="Times New Roman"/>
-        </w:rPr>
-        <w:t>Supabase</w:t>
-      </w:r>
-      <w:proofErr w:type="spellEnd"/>
-      <w:r>
-        <w:rPr>
-          <w:rFonts w:ascii="Times New Roman" w:hAnsi="Times New Roman" w:cs="Times New Roman"/>
-        </w:rPr>
-        <w:t xml:space="preserve"> verifies the user's identity, updates the database, and stores any necessary files.</w:t>
-      </w:r>
-    </w:p>
-    <w:p>
-      <w:pPr>
-        <w:numPr>
-          <w:ilvl w:val="0"/>
-          <w:numId w:val="5"/>
-        </w:numPr>
-        <w:rPr>
-          <w:rFonts w:ascii="Times New Roman" w:hAnsi="Times New Roman" w:cs="Times New Roman"/>
-        </w:rPr>
-      </w:pPr>
-      <w:r>
-        <w:rPr>
-          <w:rFonts w:ascii="Times New Roman" w:hAnsi="Times New Roman" w:cs="Times New Roman"/>
-          <w:b/>
-          <w:bCs/>
-        </w:rPr>
-        <w:t>Response:</w:t>
-      </w:r>
-      <w:r>
-        <w:rPr>
-          <w:rFonts w:ascii="Times New Roman" w:hAnsi="Times New Roman" w:cs="Times New Roman"/>
-        </w:rPr>
-        <w:t xml:space="preserve"> </w:t>
-      </w:r>
-      <w:proofErr w:type="spellStart"/>
-      <w:r>
-        <w:rPr>
-          <w:rFonts w:ascii="Times New Roman" w:hAnsi="Times New Roman" w:cs="Times New Roman"/>
-        </w:rPr>
-        <w:t>Supabase</w:t>
-      </w:r>
-      <w:proofErr w:type="spellEnd"/>
-      <w:r>
-        <w:rPr>
-          <w:rFonts w:ascii="Times New Roman" w:hAnsi="Times New Roman" w:cs="Times New Roman"/>
-        </w:rPr>
-        <w:t xml:space="preserve"> sends a confirmation back to the app, which updates the UI for the user</w:t>
-      </w:r>
-      <w:r>
-        <w:rPr>
-          <w:rFonts w:ascii="Times New Roman" w:hAnsi="Times New Roman" w:cs="Times New Roman"/>
-        </w:rPr>
-        <w:t>.</w:t>
+        <w:t xml:space="preserve"> Listens for changes in the database (e.g., a status change from "Pending" to "Confirmed") and instantly pushes updates to the Flutter app.</w:t>
       </w:r>
     </w:p>
     <w:sectPr>
@@ -11036,6 +11509,25 @@
       <w:spacing w:val="5"/>
     </w:rPr>
   </w:style>
+  <w:style w:type="table" w:styleId="TableGrid">
+    <w:name w:val="Table Grid"/>
+    <w:basedOn w:val="TableNormal"/>
+    <w:uiPriority w:val="39"/>
+    <w:rsid w:val="007902A9"/>
+    <w:pPr>
+      <w:spacing w:after="0" w:line="240" w:lineRule="auto"/>
+    </w:pPr>
+    <w:tblPr>
+      <w:tblBorders>
+        <w:top w:val="single" w:sz="4" w:space="0" w:color="auto"/>
+        <w:left w:val="single" w:sz="4" w:space="0" w:color="auto"/>
+        <w:bottom w:val="single" w:sz="4" w:space="0" w:color="auto"/>
+        <w:right w:val="single" w:sz="4" w:space="0" w:color="auto"/>
+        <w:insideH w:val="single" w:sz="4" w:space="0" w:color="auto"/>
+        <w:insideV w:val="single" w:sz="4" w:space="0" w:color="auto"/>
+      </w:tblBorders>
+    </w:tblPr>
+  </w:style>
 </w:styles>
 </file>
 

</xml_diff>